<commit_message>
Squashed 'fund-management-api/' changes from 692d594..eeee1cc
eeee1cc remove checkbox from docx submission
cfdbc71 Updated the publication reward preview replacements to resolve the applicant’s employment date via a resilient helper so the DOCX placeholder is always populated when data exists.
18bd955 new publication_reward_template.docx template
aea8d49 Removed the hard-coded checkbox glyph from publication reward preview document lines so form- and submission-based outputs now list attachments as plain text entries.
d437a86 Fix publication reward docx attachment list
362a1dd fix issues in controllers\submission.go

git-subtree-dir: fund-management-api
git-subtree-split: eeee1cc2557ebf0cd1882c41ec6433be1e038e50
</commit_message>
<xml_diff>
--- a/templates/publication_reward_template.docx
+++ b/templates/publication_reward_template.docx
@@ -6,6 +6,27 @@
       <w:pPr>
         <w:jc w:val="center"/>
         <w:rPr>
+          <w:rFonts w:ascii="TH Sarabun New" w:hAnsi="TH Sarabun New" w:cs="TH Sarabun New"/>
+          <w:b/>
+          <w:bCs/>
+          <w:sz w:val="32"/>
+          <w:szCs w:val="32"/>
+          <w:cs/>
+        </w:rPr>
+      </w:pPr>
+      <w:r>
+        <w:rPr>
+          <w:rFonts w:ascii="TH Sarabun New" w:hAnsi="TH Sarabun New" w:cs="TH Sarabun New"/>
+          <w:b/>
+          <w:bCs/>
+          <w:sz w:val="32"/>
+          <w:szCs w:val="32"/>
+          <w:cs/>
+        </w:rPr>
+        <w:t>ใบสมัครเพื่อขอใช้เงินกองทุน</w:t>
+      </w:r>
+      <w:r>
+        <w:rPr>
           <w:rFonts w:ascii="TH Sarabun New" w:hAnsi="TH Sarabun New" w:cs="TH Sarabun New" w:hint="cs"/>
           <w:b/>
           <w:bCs/>
@@ -13,7 +34,63 @@
           <w:szCs w:val="32"/>
           <w:cs/>
         </w:rPr>
-      </w:pPr>
+        <w:t>วิจัย</w:t>
+      </w:r>
+      <w:r>
+        <w:rPr>
+          <w:rFonts w:ascii="TH Sarabun New" w:eastAsia="Sarabun" w:hAnsi="TH Sarabun New" w:cs="TH Sarabun New"/>
+          <w:bCs/>
+          <w:color w:val="050505"/>
+          <w:sz w:val="32"/>
+          <w:szCs w:val="32"/>
+          <w:cs/>
+        </w:rPr>
+        <w:t xml:space="preserve"> </w:t>
+      </w:r>
+      <w:r>
+        <w:rPr>
+          <w:rFonts w:ascii="TH Sarabun New" w:eastAsia="Sarabun" w:hAnsi="TH Sarabun New" w:cs="TH Sarabun New" w:hint="cs"/>
+          <w:bCs/>
+          <w:color w:val="050505"/>
+          <w:sz w:val="32"/>
+          <w:szCs w:val="32"/>
+          <w:cs/>
+        </w:rPr>
+        <w:t>นวัตกรรม</w:t>
+      </w:r>
+      <w:r>
+        <w:rPr>
+          <w:rFonts w:ascii="TH Sarabun New" w:eastAsia="Sarabun" w:hAnsi="TH Sarabun New" w:cs="TH Sarabun New"/>
+          <w:bCs/>
+          <w:color w:val="050505"/>
+          <w:sz w:val="32"/>
+          <w:szCs w:val="32"/>
+          <w:cs/>
+        </w:rPr>
+        <w:t xml:space="preserve"> </w:t>
+      </w:r>
+      <w:r>
+        <w:rPr>
+          <w:rFonts w:ascii="TH Sarabun New" w:eastAsia="Sarabun" w:hAnsi="TH Sarabun New" w:cs="TH Sarabun New" w:hint="cs"/>
+          <w:bCs/>
+          <w:color w:val="050505"/>
+          <w:sz w:val="32"/>
+          <w:szCs w:val="32"/>
+          <w:cs/>
+        </w:rPr>
+        <w:t>และบริการวิชาการ</w:t>
+      </w:r>
+      <w:r>
+        <w:rPr>
+          <w:rFonts w:ascii="TH Sarabun New" w:eastAsia="Sarabun" w:hAnsi="TH Sarabun New" w:cs="TH Sarabun New" w:hint="cs"/>
+          <w:bCs/>
+          <w:color w:val="050505"/>
+          <w:sz w:val="32"/>
+          <w:szCs w:val="32"/>
+          <w:cs/>
+        </w:rPr>
+        <w:t xml:space="preserve"> วิทยาลัยการคอมพิวเตอร์</w:t>
+      </w:r>
       <w:r>
         <w:rPr>
           <w:rFonts w:ascii="TH Sarabun New" w:hAnsi="TH Sarabun New" w:cs="TH Sarabun New"/>
@@ -21,9 +98,8 @@
           <w:bCs/>
           <w:sz w:val="32"/>
           <w:szCs w:val="32"/>
-          <w:cs/>
-        </w:rPr>
-        <w:t>ใบสมัครเพื่อขอใช้เงินกองทุน</w:t>
+        </w:rPr>
+        <w:t xml:space="preserve"> </w:t>
       </w:r>
       <w:r>
         <w:rPr>
@@ -34,82 +110,6 @@
           <w:szCs w:val="32"/>
           <w:cs/>
         </w:rPr>
-        <w:t>วิจัย</w:t>
-      </w:r>
-      <w:r>
-        <w:rPr>
-          <w:rFonts w:ascii="TH Sarabun New" w:eastAsia="Sarabun" w:hAnsi="TH Sarabun New" w:cs="TH Sarabun New"/>
-          <w:bCs/>
-          <w:color w:val="050505"/>
-          <w:sz w:val="32"/>
-          <w:szCs w:val="32"/>
-          <w:cs/>
-        </w:rPr>
-        <w:t xml:space="preserve"> </w:t>
-      </w:r>
-      <w:r>
-        <w:rPr>
-          <w:rFonts w:ascii="TH Sarabun New" w:eastAsia="Sarabun" w:hAnsi="TH Sarabun New" w:cs="TH Sarabun New" w:hint="cs"/>
-          <w:bCs/>
-          <w:color w:val="050505"/>
-          <w:sz w:val="32"/>
-          <w:szCs w:val="32"/>
-          <w:cs/>
-        </w:rPr>
-        <w:t>นวัตกรรม</w:t>
-      </w:r>
-      <w:r>
-        <w:rPr>
-          <w:rFonts w:ascii="TH Sarabun New" w:eastAsia="Sarabun" w:hAnsi="TH Sarabun New" w:cs="TH Sarabun New"/>
-          <w:bCs/>
-          <w:color w:val="050505"/>
-          <w:sz w:val="32"/>
-          <w:szCs w:val="32"/>
-          <w:cs/>
-        </w:rPr>
-        <w:t xml:space="preserve"> </w:t>
-      </w:r>
-      <w:r>
-        <w:rPr>
-          <w:rFonts w:ascii="TH Sarabun New" w:eastAsia="Sarabun" w:hAnsi="TH Sarabun New" w:cs="TH Sarabun New" w:hint="cs"/>
-          <w:bCs/>
-          <w:color w:val="050505"/>
-          <w:sz w:val="32"/>
-          <w:szCs w:val="32"/>
-          <w:cs/>
-        </w:rPr>
-        <w:t>และบริการวิชาการ</w:t>
-      </w:r>
-      <w:r>
-        <w:rPr>
-          <w:rFonts w:ascii="TH Sarabun New" w:eastAsia="Sarabun" w:hAnsi="TH Sarabun New" w:cs="TH Sarabun New" w:hint="cs"/>
-          <w:bCs/>
-          <w:color w:val="050505"/>
-          <w:sz w:val="32"/>
-          <w:szCs w:val="32"/>
-          <w:cs/>
-        </w:rPr>
-        <w:t xml:space="preserve"> วิทยาลัยการคอมพิวเตอร์</w:t>
-      </w:r>
-      <w:r>
-        <w:rPr>
-          <w:rFonts w:ascii="TH Sarabun New" w:hAnsi="TH Sarabun New" w:cs="TH Sarabun New"/>
-          <w:b/>
-          <w:bCs/>
-          <w:sz w:val="32"/>
-          <w:szCs w:val="32"/>
-        </w:rPr>
-        <w:t xml:space="preserve"> </w:t>
-      </w:r>
-      <w:r>
-        <w:rPr>
-          <w:rFonts w:ascii="TH Sarabun New" w:hAnsi="TH Sarabun New" w:cs="TH Sarabun New" w:hint="cs"/>
-          <w:b/>
-          <w:bCs/>
-          <w:sz w:val="32"/>
-          <w:szCs w:val="32"/>
-          <w:cs/>
-        </w:rPr>
         <w:t>มหาวิทยาลัยขอนแก่น</w:t>
       </w:r>
     </w:p>
@@ -211,25 +211,7 @@
           <w:sz w:val="28"/>
           <w:szCs w:val="28"/>
         </w:rPr>
-        <w:t>{{</w:t>
-      </w:r>
-      <w:proofErr w:type="spellStart"/>
-      <w:r>
-        <w:rPr>
-          <w:rFonts w:ascii="TH Sarabun New" w:hAnsi="TH Sarabun New" w:cs="TH Sarabun New"/>
-          <w:sz w:val="28"/>
-          <w:szCs w:val="28"/>
-        </w:rPr>
-        <w:t>date_th</w:t>
-      </w:r>
-      <w:proofErr w:type="spellEnd"/>
-      <w:r>
-        <w:rPr>
-          <w:rFonts w:ascii="TH Sarabun New" w:hAnsi="TH Sarabun New" w:cs="TH Sarabun New"/>
-          <w:sz w:val="28"/>
-          <w:szCs w:val="28"/>
-        </w:rPr>
-        <w:t>}}</w:t>
+        <w:t>{{date_th}}</w:t>
       </w:r>
     </w:p>
     <w:p>
@@ -272,7 +254,7 @@
     <w:p>
       <w:pPr>
         <w:rPr>
-          <w:rFonts w:ascii="TH Sarabun New" w:hAnsi="TH Sarabun New" w:cs="TH Sarabun New" w:hint="cs"/>
+          <w:rFonts w:ascii="TH Sarabun New" w:hAnsi="TH Sarabun New" w:cs="TH Sarabun New"/>
           <w:sz w:val="28"/>
           <w:szCs w:val="28"/>
         </w:rPr>
@@ -355,25 +337,7 @@
           <w:sz w:val="28"/>
           <w:szCs w:val="28"/>
         </w:rPr>
-        <w:t>{{</w:t>
-      </w:r>
-      <w:proofErr w:type="spellStart"/>
-      <w:r>
-        <w:rPr>
-          <w:rFonts w:ascii="TH Sarabun New" w:hAnsi="TH Sarabun New" w:cs="TH Sarabun New"/>
-          <w:sz w:val="28"/>
-          <w:szCs w:val="28"/>
-        </w:rPr>
-        <w:t>applicant_name</w:t>
-      </w:r>
-      <w:proofErr w:type="spellEnd"/>
-      <w:r>
-        <w:rPr>
-          <w:rFonts w:ascii="TH Sarabun New" w:hAnsi="TH Sarabun New" w:cs="TH Sarabun New"/>
-          <w:sz w:val="28"/>
-          <w:szCs w:val="28"/>
-        </w:rPr>
-        <w:t>}}</w:t>
+        <w:t>{{applicant_name}}</w:t>
       </w:r>
       <w:r>
         <w:rPr>
@@ -407,25 +371,7 @@
           <w:sz w:val="28"/>
           <w:szCs w:val="28"/>
         </w:rPr>
-        <w:t>{{</w:t>
-      </w:r>
-      <w:proofErr w:type="spellStart"/>
-      <w:r>
-        <w:rPr>
-          <w:rFonts w:ascii="TH Sarabun New" w:hAnsi="TH Sarabun New" w:cs="TH Sarabun New"/>
-          <w:sz w:val="28"/>
-          <w:szCs w:val="28"/>
-        </w:rPr>
-        <w:t>date_of_employment</w:t>
-      </w:r>
-      <w:proofErr w:type="spellEnd"/>
-      <w:r>
-        <w:rPr>
-          <w:rFonts w:ascii="TH Sarabun New" w:hAnsi="TH Sarabun New" w:cs="TH Sarabun New"/>
-          <w:sz w:val="28"/>
-          <w:szCs w:val="28"/>
-        </w:rPr>
-        <w:t>}}</w:t>
+        <w:t>{{date_of_employment}}</w:t>
       </w:r>
       <w:r>
         <w:rPr>
@@ -712,7 +658,7 @@
         <w:ind w:left="0" w:firstLine="720"/>
         <w:jc w:val="both"/>
         <w:rPr>
-          <w:rFonts w:ascii="TH Sarabun New" w:hAnsi="TH Sarabun New" w:cs="TH Sarabun New" w:hint="cs"/>
+          <w:rFonts w:ascii="TH Sarabun New" w:hAnsi="TH Sarabun New" w:cs="TH Sarabun New"/>
           <w:sz w:val="28"/>
           <w:szCs w:val="28"/>
           <w:cs/>
@@ -733,25 +679,7 @@
           <w:sz w:val="28"/>
           <w:szCs w:val="28"/>
         </w:rPr>
-        <w:t>{{</w:t>
-      </w:r>
-      <w:proofErr w:type="spellStart"/>
-      <w:r>
-        <w:rPr>
-          <w:rFonts w:ascii="TH Sarabun New" w:hAnsi="TH Sarabun New" w:cs="TH Sarabun New"/>
-          <w:sz w:val="28"/>
-          <w:szCs w:val="28"/>
-        </w:rPr>
-        <w:t>total_amount</w:t>
-      </w:r>
-      <w:proofErr w:type="spellEnd"/>
-      <w:r>
-        <w:rPr>
-          <w:rFonts w:ascii="TH Sarabun New" w:hAnsi="TH Sarabun New" w:cs="TH Sarabun New"/>
-          <w:sz w:val="28"/>
-          <w:szCs w:val="28"/>
-        </w:rPr>
-        <w:t xml:space="preserve">}} </w:t>
+        <w:t xml:space="preserve">{{total_amount}} </w:t>
       </w:r>
       <w:r>
         <w:rPr>
@@ -784,16 +712,7 @@
           <w:sz w:val="28"/>
           <w:szCs w:val="28"/>
         </w:rPr>
-        <w:t>{{</w:t>
-      </w:r>
-      <w:proofErr w:type="spellStart"/>
-      <w:r>
-        <w:rPr>
-          <w:rFonts w:ascii="TH Sarabun New" w:hAnsi="TH Sarabun New" w:cs="TH Sarabun New"/>
-          <w:sz w:val="28"/>
-          <w:szCs w:val="28"/>
-        </w:rPr>
-        <w:t>total_amount_</w:t>
+        <w:t>{{total_amount_</w:t>
       </w:r>
       <w:r>
         <w:rPr>
@@ -803,7 +722,6 @@
         </w:rPr>
         <w:t>text</w:t>
       </w:r>
-      <w:proofErr w:type="spellEnd"/>
       <w:r>
         <w:rPr>
           <w:rFonts w:ascii="TH Sarabun New" w:hAnsi="TH Sarabun New" w:cs="TH Sarabun New"/>
@@ -881,7 +799,7 @@
         <w:ind w:left="0" w:firstLine="720"/>
         <w:jc w:val="both"/>
         <w:rPr>
-          <w:rFonts w:ascii="TH Sarabun New" w:hAnsi="TH Sarabun New" w:cs="TH Sarabun New" w:hint="cs"/>
+          <w:rFonts w:ascii="TH Sarabun New" w:hAnsi="TH Sarabun New" w:cs="TH Sarabun New"/>
           <w:sz w:val="28"/>
           <w:szCs w:val="28"/>
           <w:cs/>
@@ -956,96 +874,15 @@
           <w:sz w:val="28"/>
           <w:szCs w:val="28"/>
         </w:rPr>
-        <w:t>{{</w:t>
-      </w:r>
-      <w:proofErr w:type="spellStart"/>
-      <w:r>
-        <w:rPr>
-          <w:rFonts w:ascii="TH Sarabun New" w:hAnsi="TH Sarabun New" w:cs="TH Sarabun New"/>
-          <w:sz w:val="28"/>
-          <w:szCs w:val="28"/>
-        </w:rPr>
-        <w:t>author_name_list</w:t>
-      </w:r>
-      <w:proofErr w:type="spellEnd"/>
-      <w:r>
-        <w:rPr>
-          <w:rFonts w:ascii="TH Sarabun New" w:hAnsi="TH Sarabun New" w:cs="TH Sarabun New"/>
-          <w:sz w:val="28"/>
-          <w:szCs w:val="28"/>
-        </w:rPr>
-        <w:t>}}</w:t>
-      </w:r>
-      <w:r>
-        <w:rPr>
-          <w:rFonts w:ascii="TH Sarabun New" w:hAnsi="TH Sarabun New" w:cs="TH Sarabun New"/>
-          <w:sz w:val="28"/>
-          <w:szCs w:val="28"/>
-        </w:rPr>
-        <w:t xml:space="preserve"> {{</w:t>
-      </w:r>
-      <w:proofErr w:type="spellStart"/>
-      <w:r>
-        <w:rPr>
-          <w:rFonts w:ascii="TH Sarabun New" w:hAnsi="TH Sarabun New" w:cs="TH Sarabun New"/>
-          <w:sz w:val="28"/>
-          <w:szCs w:val="28"/>
-        </w:rPr>
-        <w:t>paper_title</w:t>
-      </w:r>
-      <w:proofErr w:type="spellEnd"/>
-      <w:r>
-        <w:rPr>
-          <w:rFonts w:ascii="TH Sarabun New" w:hAnsi="TH Sarabun New" w:cs="TH Sarabun New"/>
-          <w:sz w:val="28"/>
-          <w:szCs w:val="28"/>
-        </w:rPr>
-        <w:t>}} {{</w:t>
-      </w:r>
-      <w:proofErr w:type="spellStart"/>
-      <w:r>
-        <w:rPr>
-          <w:rFonts w:ascii="TH Sarabun New" w:hAnsi="TH Sarabun New" w:cs="TH Sarabun New"/>
-          <w:sz w:val="28"/>
-          <w:szCs w:val="28"/>
-        </w:rPr>
-        <w:t>journal_name</w:t>
-      </w:r>
-      <w:proofErr w:type="spellEnd"/>
-      <w:r>
-        <w:rPr>
-          <w:rFonts w:ascii="TH Sarabun New" w:hAnsi="TH Sarabun New" w:cs="TH Sarabun New"/>
-          <w:sz w:val="28"/>
-          <w:szCs w:val="28"/>
-        </w:rPr>
-        <w:t>}} {{</w:t>
-      </w:r>
-      <w:proofErr w:type="spellStart"/>
-      <w:r>
-        <w:rPr>
-          <w:rFonts w:ascii="TH Sarabun New" w:hAnsi="TH Sarabun New" w:cs="TH Sarabun New"/>
-          <w:sz w:val="28"/>
-          <w:szCs w:val="28"/>
-        </w:rPr>
-        <w:t>publication_year</w:t>
-      </w:r>
-      <w:proofErr w:type="spellEnd"/>
-      <w:r>
-        <w:rPr>
-          <w:rFonts w:ascii="TH Sarabun New" w:hAnsi="TH Sarabun New" w:cs="TH Sarabun New"/>
-          <w:sz w:val="28"/>
-          <w:szCs w:val="28"/>
-        </w:rPr>
-        <w:t>}} {{</w:t>
-      </w:r>
-      <w:proofErr w:type="spellStart"/>
-      <w:r>
-        <w:rPr>
-          <w:rFonts w:ascii="TH Sarabun New" w:hAnsi="TH Sarabun New" w:cs="TH Sarabun New"/>
-          <w:sz w:val="28"/>
-          <w:szCs w:val="28"/>
-        </w:rPr>
-        <w:t>volum</w:t>
+        <w:t>{{author_name_list}}</w:t>
+      </w:r>
+      <w:r>
+        <w:rPr>
+          <w:rFonts w:ascii="TH Sarabun New" w:hAnsi="TH Sarabun New" w:cs="TH Sarabun New"/>
+          <w:sz w:val="28"/>
+          <w:szCs w:val="28"/>
+        </w:rPr>
+        <w:t xml:space="preserve"> {{paper_title}} {{journal_name}} {{publication_year}} {{volum</w:t>
       </w:r>
       <w:r>
         <w:rPr>
@@ -1061,34 +898,7 @@
           <w:sz w:val="28"/>
           <w:szCs w:val="28"/>
         </w:rPr>
-        <w:t>_issue</w:t>
-      </w:r>
-      <w:proofErr w:type="spellEnd"/>
-      <w:r>
-        <w:rPr>
-          <w:rFonts w:ascii="TH Sarabun New" w:hAnsi="TH Sarabun New" w:cs="TH Sarabun New"/>
-          <w:sz w:val="28"/>
-          <w:szCs w:val="28"/>
-        </w:rPr>
-        <w:t>}} {{</w:t>
-      </w:r>
-      <w:proofErr w:type="spellStart"/>
-      <w:r>
-        <w:rPr>
-          <w:rFonts w:ascii="TH Sarabun New" w:hAnsi="TH Sarabun New" w:cs="TH Sarabun New"/>
-          <w:sz w:val="28"/>
-          <w:szCs w:val="28"/>
-        </w:rPr>
-        <w:t>page_number</w:t>
-      </w:r>
-      <w:proofErr w:type="spellEnd"/>
-      <w:r>
-        <w:rPr>
-          <w:rFonts w:ascii="TH Sarabun New" w:hAnsi="TH Sarabun New" w:cs="TH Sarabun New"/>
-          <w:sz w:val="28"/>
-          <w:szCs w:val="28"/>
-        </w:rPr>
-        <w:t>}}</w:t>
+        <w:t>_issue}} {{page_number}}</w:t>
       </w:r>
     </w:p>
     <w:p>
@@ -1117,25 +927,7 @@
           <w:sz w:val="28"/>
           <w:szCs w:val="28"/>
         </w:rPr>
-        <w:t>{{</w:t>
-      </w:r>
-      <w:proofErr w:type="spellStart"/>
-      <w:r>
-        <w:rPr>
-          <w:rFonts w:ascii="TH Sarabun New" w:hAnsi="TH Sarabun New" w:cs="TH Sarabun New"/>
-          <w:sz w:val="28"/>
-          <w:szCs w:val="28"/>
-        </w:rPr>
-        <w:t>author_role</w:t>
-      </w:r>
-      <w:proofErr w:type="spellEnd"/>
-      <w:r>
-        <w:rPr>
-          <w:rFonts w:ascii="TH Sarabun New" w:hAnsi="TH Sarabun New" w:cs="TH Sarabun New"/>
-          <w:sz w:val="28"/>
-          <w:szCs w:val="28"/>
-        </w:rPr>
-        <w:t>}}</w:t>
+        <w:t>{{author_role}}</w:t>
       </w:r>
       <w:r>
         <w:rPr>
@@ -1161,16 +953,7 @@
           <w:sz w:val="28"/>
           <w:szCs w:val="28"/>
         </w:rPr>
-        <w:t xml:space="preserve"> {{</w:t>
-      </w:r>
-      <w:proofErr w:type="spellStart"/>
-      <w:r>
-        <w:rPr>
-          <w:rFonts w:ascii="TH Sarabun New" w:hAnsi="TH Sarabun New" w:cs="TH Sarabun New"/>
-          <w:sz w:val="28"/>
-          <w:szCs w:val="28"/>
-        </w:rPr>
-        <w:t>quartile</w:t>
+        <w:t xml:space="preserve"> {{quartile</w:t>
       </w:r>
       <w:r>
         <w:rPr>
@@ -1180,7 +963,6 @@
         </w:rPr>
         <w:t>_line</w:t>
       </w:r>
-      <w:proofErr w:type="spellEnd"/>
       <w:r>
         <w:rPr>
           <w:rFonts w:ascii="TH Sarabun New" w:hAnsi="TH Sarabun New" w:cs="TH Sarabun New"/>
@@ -1196,7 +978,7 @@
         <w:ind w:left="0" w:firstLine="0"/>
         <w:jc w:val="both"/>
         <w:rPr>
-          <w:rFonts w:ascii="TH Sarabun New" w:hAnsi="TH Sarabun New" w:cs="TH Sarabun New" w:hint="cs"/>
+          <w:rFonts w:ascii="TH Sarabun New" w:hAnsi="TH Sarabun New" w:cs="TH Sarabun New"/>
           <w:sz w:val="28"/>
           <w:szCs w:val="28"/>
           <w:cs/>
@@ -1261,7 +1043,6 @@
     <w:p>
       <w:pPr>
         <w:ind w:left="720" w:right="43" w:firstLine="720"/>
-        <w:jc w:val="thaiDistribute"/>
         <w:rPr>
           <w:rFonts w:ascii="TH Sarabun New" w:hAnsi="TH Sarabun New" w:cs="TH Sarabun New" w:hint="cs"/>
           <w:sz w:val="28"/>
@@ -1275,26 +1056,16 @@
           <w:color w:val="000000"/>
           <w:sz w:val="28"/>
         </w:rPr>
-        <w:t>{{</w:t>
-      </w:r>
-      <w:proofErr w:type="spellStart"/>
+        <w:t>{{document</w:t>
+      </w:r>
       <w:r>
         <w:rPr>
           <w:rFonts w:ascii="TH Sarabun New" w:hAnsi="TH Sarabun New" w:cs="TH Sarabun New"/>
           <w:color w:val="000000"/>
           <w:sz w:val="28"/>
         </w:rPr>
-        <w:t>document</w:t>
-      </w:r>
-      <w:r>
-        <w:rPr>
-          <w:rFonts w:ascii="TH Sarabun New" w:hAnsi="TH Sarabun New" w:cs="TH Sarabun New"/>
-          <w:color w:val="000000"/>
-          <w:sz w:val="28"/>
-        </w:rPr>
         <w:t>_line</w:t>
       </w:r>
-      <w:proofErr w:type="spellEnd"/>
       <w:r>
         <w:rPr>
           <w:rFonts w:ascii="TH Sarabun New" w:hAnsi="TH Sarabun New" w:cs="TH Sarabun New"/>
@@ -1307,7 +1078,7 @@
     <w:p>
       <w:pPr>
         <w:rPr>
-          <w:rFonts w:ascii="TH Sarabun New" w:hAnsi="TH Sarabun New" w:cs="TH Sarabun New" w:hint="cs"/>
+          <w:rFonts w:ascii="TH Sarabun New" w:hAnsi="TH Sarabun New" w:cs="TH Sarabun New"/>
           <w:sz w:val="28"/>
           <w:szCs w:val="28"/>
           <w:cs/>
@@ -1449,44 +1220,44 @@
         <w:ind w:left="284" w:hanging="284"/>
         <w:jc w:val="thaiDistribute"/>
         <w:rPr>
+          <w:rFonts w:ascii="TH Sarabun New" w:hAnsi="TH Sarabun New" w:cs="TH Sarabun New"/>
+          <w:sz w:val="28"/>
+          <w:szCs w:val="28"/>
+          <w:cs/>
+        </w:rPr>
+      </w:pPr>
+      <w:r>
+        <w:rPr>
+          <w:rFonts w:ascii="Segoe UI Symbol" w:hAnsi="Segoe UI Symbol" w:cs="Segoe UI Symbol"/>
+          <w:sz w:val="28"/>
+          <w:szCs w:val="28"/>
+        </w:rPr>
+        <w:t>☑</w:t>
+      </w:r>
+      <w:r>
+        <w:rPr>
+          <w:rFonts w:ascii="TH Sarabun New" w:hAnsi="TH Sarabun New" w:cs="TH Sarabun New"/>
+          <w:sz w:val="28"/>
+          <w:szCs w:val="28"/>
+        </w:rPr>
+        <w:t xml:space="preserve"> </w:t>
+      </w:r>
+      <w:r>
+        <w:rPr>
+          <w:rFonts w:ascii="TH Sarabun New" w:hAnsi="TH Sarabun New" w:cs="TH Sarabun New"/>
+          <w:sz w:val="28"/>
+          <w:szCs w:val="28"/>
+          <w:cs/>
+        </w:rPr>
+        <w:t>จะปฏิบัติตามระเบียบมหาวิทยาลัยขอนแก่น ว่าด้วยกองทุน</w:t>
+      </w:r>
+      <w:r>
+        <w:rPr>
           <w:rFonts w:ascii="TH Sarabun New" w:hAnsi="TH Sarabun New" w:cs="TH Sarabun New" w:hint="cs"/>
           <w:sz w:val="28"/>
           <w:szCs w:val="28"/>
           <w:cs/>
         </w:rPr>
-      </w:pPr>
-      <w:r>
-        <w:rPr>
-          <w:rFonts w:ascii="Segoe UI Symbol" w:hAnsi="Segoe UI Symbol" w:cs="Segoe UI Symbol"/>
-          <w:sz w:val="28"/>
-          <w:szCs w:val="28"/>
-        </w:rPr>
-        <w:t>☑</w:t>
-      </w:r>
-      <w:r>
-        <w:rPr>
-          <w:rFonts w:ascii="TH Sarabun New" w:hAnsi="TH Sarabun New" w:cs="TH Sarabun New"/>
-          <w:sz w:val="28"/>
-          <w:szCs w:val="28"/>
-        </w:rPr>
-        <w:t xml:space="preserve"> </w:t>
-      </w:r>
-      <w:r>
-        <w:rPr>
-          <w:rFonts w:ascii="TH Sarabun New" w:hAnsi="TH Sarabun New" w:cs="TH Sarabun New"/>
-          <w:sz w:val="28"/>
-          <w:szCs w:val="28"/>
-          <w:cs/>
-        </w:rPr>
-        <w:t>จะปฏิบัติตามระเบียบมหาวิทยาลัยขอนแก่น ว่าด้วยกองทุน</w:t>
-      </w:r>
-      <w:r>
-        <w:rPr>
-          <w:rFonts w:ascii="TH Sarabun New" w:hAnsi="TH Sarabun New" w:cs="TH Sarabun New" w:hint="cs"/>
-          <w:sz w:val="28"/>
-          <w:szCs w:val="28"/>
-          <w:cs/>
-        </w:rPr>
         <w:t>วิจัยในระดับคณะ</w:t>
       </w:r>
       <w:r>
@@ -1529,25 +1300,7 @@
           <w:sz w:val="28"/>
           <w:szCs w:val="28"/>
         </w:rPr>
-        <w:t>{{</w:t>
-      </w:r>
-      <w:proofErr w:type="spellStart"/>
-      <w:r>
-        <w:rPr>
-          <w:rFonts w:ascii="TH Sarabun New" w:hAnsi="TH Sarabun New" w:cs="TH Sarabun New"/>
-          <w:sz w:val="28"/>
-          <w:szCs w:val="28"/>
-        </w:rPr>
-        <w:t>kku_report_year</w:t>
-      </w:r>
-      <w:proofErr w:type="spellEnd"/>
-      <w:r>
-        <w:rPr>
-          <w:rFonts w:ascii="TH Sarabun New" w:hAnsi="TH Sarabun New" w:cs="TH Sarabun New"/>
-          <w:sz w:val="28"/>
-          <w:szCs w:val="28"/>
-        </w:rPr>
-        <w:t xml:space="preserve">}} </w:t>
+        <w:t xml:space="preserve">{{kku_report_year}} </w:t>
       </w:r>
       <w:r>
         <w:rPr>
@@ -1567,7 +1320,7 @@
         <w:ind w:left="284" w:hanging="284"/>
         <w:jc w:val="thaiDistribute"/>
         <w:rPr>
-          <w:rFonts w:ascii="TH Sarabun New" w:hAnsi="TH Sarabun New" w:cs="TH Sarabun New" w:hint="cs"/>
+          <w:rFonts w:ascii="TH Sarabun New" w:hAnsi="TH Sarabun New" w:cs="TH Sarabun New"/>
           <w:sz w:val="28"/>
           <w:szCs w:val="28"/>
         </w:rPr>
@@ -1685,7 +1438,7 @@
         </w:tabs>
         <w:jc w:val="thaiDistribute"/>
         <w:rPr>
-          <w:rFonts w:ascii="TH Sarabun New" w:hAnsi="TH Sarabun New" w:cs="TH Sarabun New" w:hint="cs"/>
+          <w:rFonts w:ascii="TH Sarabun New" w:hAnsi="TH Sarabun New" w:cs="TH Sarabun New"/>
           <w:sz w:val="28"/>
           <w:szCs w:val="28"/>
         </w:rPr>
@@ -1713,25 +1466,7 @@
           <w:sz w:val="28"/>
           <w:szCs w:val="28"/>
         </w:rPr>
-        <w:t>{{</w:t>
-      </w:r>
-      <w:proofErr w:type="spellStart"/>
-      <w:r>
-        <w:rPr>
-          <w:rFonts w:ascii="TH Sarabun New" w:hAnsi="TH Sarabun New" w:cs="TH Sarabun New"/>
-          <w:sz w:val="28"/>
-          <w:szCs w:val="28"/>
-        </w:rPr>
-        <w:t>applicant_name</w:t>
-      </w:r>
-      <w:proofErr w:type="spellEnd"/>
-      <w:r>
-        <w:rPr>
-          <w:rFonts w:ascii="TH Sarabun New" w:hAnsi="TH Sarabun New" w:cs="TH Sarabun New"/>
-          <w:sz w:val="28"/>
-          <w:szCs w:val="28"/>
-        </w:rPr>
-        <w:t>}}</w:t>
+        <w:t>{{applicant_name}}</w:t>
       </w:r>
       <w:r>
         <w:rPr>
@@ -1901,7 +1636,7 @@
       <w:pStyle w:val="Header"/>
       <w:jc w:val="right"/>
       <w:rPr>
-        <w:rFonts w:ascii="TH Sarabun New" w:hAnsi="TH Sarabun New" w:cs="TH Sarabun New" w:hint="cs"/>
+        <w:rFonts w:ascii="TH Sarabun New" w:hAnsi="TH Sarabun New" w:cs="TH Sarabun New"/>
       </w:rPr>
     </w:pPr>
   </w:p>
@@ -1943,19 +1678,8 @@
         <w:szCs w:val="28"/>
         <w:cs/>
       </w:rPr>
-      <w:t xml:space="preserve"> </w:t>
+      <w:t xml:space="preserve"> กท</w:t>
     </w:r>
-    <w:proofErr w:type="spellStart"/>
-    <w:r>
-      <w:rPr>
-        <w:rFonts w:ascii="Angsana New" w:hAnsi="Angsana New"/>
-        <w:sz w:val="28"/>
-        <w:szCs w:val="28"/>
-        <w:cs/>
-      </w:rPr>
-      <w:t>กท</w:t>
-    </w:r>
-    <w:proofErr w:type="spellEnd"/>
     <w:r>
       <w:rPr>
         <w:rFonts w:ascii="Angsana New" w:hAnsi="Angsana New" w:hint="cs"/>
@@ -3393,6 +3117,50 @@
     <w:lsdException w:name="Subtitle" w:qFormat="1"/>
     <w:lsdException w:name="Strong" w:uiPriority="22" w:qFormat="1"/>
     <w:lsdException w:name="Emphasis" w:qFormat="1"/>
+    <w:lsdException w:name="Normal Table" w:semiHidden="1" w:unhideWhenUsed="1"/>
+    <w:lsdException w:name="Table Simple 1" w:semiHidden="1" w:unhideWhenUsed="1"/>
+    <w:lsdException w:name="Table Simple 2" w:semiHidden="1" w:unhideWhenUsed="1"/>
+    <w:lsdException w:name="Table Simple 3" w:semiHidden="1" w:unhideWhenUsed="1"/>
+    <w:lsdException w:name="Table Classic 1" w:semiHidden="1" w:unhideWhenUsed="1"/>
+    <w:lsdException w:name="Table Classic 2" w:semiHidden="1" w:unhideWhenUsed="1"/>
+    <w:lsdException w:name="Table Classic 3" w:semiHidden="1" w:unhideWhenUsed="1"/>
+    <w:lsdException w:name="Table Classic 4" w:semiHidden="1" w:unhideWhenUsed="1"/>
+    <w:lsdException w:name="Table Colorful 1" w:semiHidden="1" w:unhideWhenUsed="1"/>
+    <w:lsdException w:name="Table Colorful 2" w:semiHidden="1" w:unhideWhenUsed="1"/>
+    <w:lsdException w:name="Table Colorful 3" w:semiHidden="1" w:unhideWhenUsed="1"/>
+    <w:lsdException w:name="Table Columns 1" w:semiHidden="1" w:unhideWhenUsed="1"/>
+    <w:lsdException w:name="Table Columns 2" w:semiHidden="1" w:unhideWhenUsed="1"/>
+    <w:lsdException w:name="Table Columns 3" w:semiHidden="1" w:unhideWhenUsed="1"/>
+    <w:lsdException w:name="Table Columns 4" w:semiHidden="1" w:unhideWhenUsed="1"/>
+    <w:lsdException w:name="Table Columns 5" w:semiHidden="1" w:unhideWhenUsed="1"/>
+    <w:lsdException w:name="Table Grid 1" w:semiHidden="1" w:unhideWhenUsed="1"/>
+    <w:lsdException w:name="Table Grid 2" w:semiHidden="1" w:unhideWhenUsed="1"/>
+    <w:lsdException w:name="Table Grid 3" w:semiHidden="1" w:unhideWhenUsed="1"/>
+    <w:lsdException w:name="Table Grid 4" w:semiHidden="1" w:unhideWhenUsed="1"/>
+    <w:lsdException w:name="Table Grid 5" w:semiHidden="1" w:unhideWhenUsed="1"/>
+    <w:lsdException w:name="Table Grid 6" w:semiHidden="1" w:unhideWhenUsed="1"/>
+    <w:lsdException w:name="Table Grid 7" w:semiHidden="1" w:unhideWhenUsed="1"/>
+    <w:lsdException w:name="Table Grid 8" w:semiHidden="1" w:unhideWhenUsed="1"/>
+    <w:lsdException w:name="Table List 1" w:semiHidden="1" w:unhideWhenUsed="1"/>
+    <w:lsdException w:name="Table List 2" w:semiHidden="1" w:unhideWhenUsed="1"/>
+    <w:lsdException w:name="Table List 3" w:semiHidden="1" w:unhideWhenUsed="1"/>
+    <w:lsdException w:name="Table List 4" w:semiHidden="1" w:unhideWhenUsed="1"/>
+    <w:lsdException w:name="Table List 5" w:semiHidden="1" w:unhideWhenUsed="1"/>
+    <w:lsdException w:name="Table List 6" w:semiHidden="1" w:unhideWhenUsed="1"/>
+    <w:lsdException w:name="Table List 7" w:semiHidden="1" w:unhideWhenUsed="1"/>
+    <w:lsdException w:name="Table List 8" w:semiHidden="1" w:unhideWhenUsed="1"/>
+    <w:lsdException w:name="Table 3D effects 1" w:semiHidden="1" w:unhideWhenUsed="1"/>
+    <w:lsdException w:name="Table 3D effects 2" w:semiHidden="1" w:unhideWhenUsed="1"/>
+    <w:lsdException w:name="Table 3D effects 3" w:semiHidden="1" w:unhideWhenUsed="1"/>
+    <w:lsdException w:name="Table Contemporary" w:semiHidden="1" w:unhideWhenUsed="1"/>
+    <w:lsdException w:name="Table Elegant" w:semiHidden="1" w:unhideWhenUsed="1"/>
+    <w:lsdException w:name="Table Professional" w:semiHidden="1" w:unhideWhenUsed="1"/>
+    <w:lsdException w:name="Table Subtle 1" w:semiHidden="1" w:unhideWhenUsed="1"/>
+    <w:lsdException w:name="Table Subtle 2" w:semiHidden="1" w:unhideWhenUsed="1"/>
+    <w:lsdException w:name="Table Web 1" w:semiHidden="1" w:unhideWhenUsed="1"/>
+    <w:lsdException w:name="Table Web 2" w:semiHidden="1" w:unhideWhenUsed="1"/>
+    <w:lsdException w:name="Table Web 3" w:semiHidden="1" w:unhideWhenUsed="1"/>
+    <w:lsdException w:name="Table Theme" w:semiHidden="1" w:unhideWhenUsed="1"/>
     <w:lsdException w:name="Placeholder Text" w:semiHidden="1" w:uiPriority="99"/>
     <w:lsdException w:name="No Spacing" w:uiPriority="1" w:qFormat="1"/>
     <w:lsdException w:name="Light Shading" w:uiPriority="60"/>
@@ -3642,11 +3410,15 @@
   </w:style>
   <w:style w:type="character" w:default="1" w:styleId="DefaultParagraphFont">
     <w:name w:val="Default Paragraph Font"/>
+    <w:uiPriority w:val="1"/>
     <w:semiHidden/>
+    <w:unhideWhenUsed/>
   </w:style>
   <w:style w:type="table" w:default="1" w:styleId="TableNormal">
     <w:name w:val="Normal Table"/>
+    <w:uiPriority w:val="99"/>
     <w:semiHidden/>
+    <w:unhideWhenUsed/>
     <w:tblPr>
       <w:tblInd w:w="0" w:type="dxa"/>
       <w:tblCellMar>
@@ -3659,7 +3431,9 @@
   </w:style>
   <w:style w:type="numbering" w:default="1" w:styleId="NoList">
     <w:name w:val="No List"/>
+    <w:uiPriority w:val="99"/>
     <w:semiHidden/>
+    <w:unhideWhenUsed/>
   </w:style>
   <w:style w:type="paragraph" w:styleId="Header">
     <w:name w:val="header"/>

</xml_diff>

<commit_message>
Squashed 'fund-management-api/' changes from 56db7e7..39cf05c
39cf05c Merge branch 'main' of https://github.com/spw32767/fund-management-api
6b11a44 add new docx template for dept head

git-subtree-dir: fund-management-api
git-subtree-split: 39cf05c6161463ae04b806f9ea3a511d8686f54f
</commit_message>
<xml_diff>
--- a/templates/publication_reward_template.docx
+++ b/templates/publication_reward_template.docx
@@ -211,7 +211,25 @@
           <w:sz w:val="28"/>
           <w:szCs w:val="28"/>
         </w:rPr>
-        <w:t>{{date_th}}</w:t>
+        <w:t>{{</w:t>
+      </w:r>
+      <w:proofErr w:type="spellStart"/>
+      <w:r>
+        <w:rPr>
+          <w:rFonts w:ascii="TH Sarabun New" w:hAnsi="TH Sarabun New" w:cs="TH Sarabun New"/>
+          <w:sz w:val="28"/>
+          <w:szCs w:val="28"/>
+        </w:rPr>
+        <w:t>date_th</w:t>
+      </w:r>
+      <w:proofErr w:type="spellEnd"/>
+      <w:r>
+        <w:rPr>
+          <w:rFonts w:ascii="TH Sarabun New" w:hAnsi="TH Sarabun New" w:cs="TH Sarabun New"/>
+          <w:sz w:val="28"/>
+          <w:szCs w:val="28"/>
+        </w:rPr>
+        <w:t>}}</w:t>
       </w:r>
     </w:p>
     <w:p>
@@ -337,7 +355,25 @@
           <w:sz w:val="28"/>
           <w:szCs w:val="28"/>
         </w:rPr>
-        <w:t>{{applicant_name}}</w:t>
+        <w:t>{{</w:t>
+      </w:r>
+      <w:proofErr w:type="spellStart"/>
+      <w:r>
+        <w:rPr>
+          <w:rFonts w:ascii="TH Sarabun New" w:hAnsi="TH Sarabun New" w:cs="TH Sarabun New"/>
+          <w:sz w:val="28"/>
+          <w:szCs w:val="28"/>
+        </w:rPr>
+        <w:t>applicant_name</w:t>
+      </w:r>
+      <w:proofErr w:type="spellEnd"/>
+      <w:r>
+        <w:rPr>
+          <w:rFonts w:ascii="TH Sarabun New" w:hAnsi="TH Sarabun New" w:cs="TH Sarabun New"/>
+          <w:sz w:val="28"/>
+          <w:szCs w:val="28"/>
+        </w:rPr>
+        <w:t>}}</w:t>
       </w:r>
       <w:r>
         <w:rPr>
@@ -371,7 +407,25 @@
           <w:sz w:val="28"/>
           <w:szCs w:val="28"/>
         </w:rPr>
-        <w:t>{{date_of_employment}}</w:t>
+        <w:t>{{</w:t>
+      </w:r>
+      <w:proofErr w:type="spellStart"/>
+      <w:r>
+        <w:rPr>
+          <w:rFonts w:ascii="TH Sarabun New" w:hAnsi="TH Sarabun New" w:cs="TH Sarabun New"/>
+          <w:sz w:val="28"/>
+          <w:szCs w:val="28"/>
+        </w:rPr>
+        <w:t>date_of_employment</w:t>
+      </w:r>
+      <w:proofErr w:type="spellEnd"/>
+      <w:r>
+        <w:rPr>
+          <w:rFonts w:ascii="TH Sarabun New" w:hAnsi="TH Sarabun New" w:cs="TH Sarabun New"/>
+          <w:sz w:val="28"/>
+          <w:szCs w:val="28"/>
+        </w:rPr>
+        <w:t>}}</w:t>
       </w:r>
       <w:r>
         <w:rPr>
@@ -679,7 +733,25 @@
           <w:sz w:val="28"/>
           <w:szCs w:val="28"/>
         </w:rPr>
-        <w:t xml:space="preserve">{{total_amount}} </w:t>
+        <w:t>{{</w:t>
+      </w:r>
+      <w:proofErr w:type="spellStart"/>
+      <w:r>
+        <w:rPr>
+          <w:rFonts w:ascii="TH Sarabun New" w:hAnsi="TH Sarabun New" w:cs="TH Sarabun New"/>
+          <w:sz w:val="28"/>
+          <w:szCs w:val="28"/>
+        </w:rPr>
+        <w:t>total_amount</w:t>
+      </w:r>
+      <w:proofErr w:type="spellEnd"/>
+      <w:r>
+        <w:rPr>
+          <w:rFonts w:ascii="TH Sarabun New" w:hAnsi="TH Sarabun New" w:cs="TH Sarabun New"/>
+          <w:sz w:val="28"/>
+          <w:szCs w:val="28"/>
+        </w:rPr>
+        <w:t xml:space="preserve">}} </w:t>
       </w:r>
       <w:r>
         <w:rPr>
@@ -712,7 +784,16 @@
           <w:sz w:val="28"/>
           <w:szCs w:val="28"/>
         </w:rPr>
-        <w:t>{{total_amount_</w:t>
+        <w:t>{{</w:t>
+      </w:r>
+      <w:proofErr w:type="spellStart"/>
+      <w:r>
+        <w:rPr>
+          <w:rFonts w:ascii="TH Sarabun New" w:hAnsi="TH Sarabun New" w:cs="TH Sarabun New"/>
+          <w:sz w:val="28"/>
+          <w:szCs w:val="28"/>
+        </w:rPr>
+        <w:t>total_amount_</w:t>
       </w:r>
       <w:r>
         <w:rPr>
@@ -722,6 +803,7 @@
         </w:rPr>
         <w:t>text</w:t>
       </w:r>
+      <w:proofErr w:type="spellEnd"/>
       <w:r>
         <w:rPr>
           <w:rFonts w:ascii="TH Sarabun New" w:hAnsi="TH Sarabun New" w:cs="TH Sarabun New"/>
@@ -874,15 +956,96 @@
           <w:sz w:val="28"/>
           <w:szCs w:val="28"/>
         </w:rPr>
-        <w:t>{{author_name_list}}</w:t>
-      </w:r>
-      <w:r>
-        <w:rPr>
-          <w:rFonts w:ascii="TH Sarabun New" w:hAnsi="TH Sarabun New" w:cs="TH Sarabun New"/>
-          <w:sz w:val="28"/>
-          <w:szCs w:val="28"/>
-        </w:rPr>
-        <w:t xml:space="preserve"> {{paper_title}} {{journal_name}} {{publication_year}} {{volum</w:t>
+        <w:t>{{</w:t>
+      </w:r>
+      <w:proofErr w:type="spellStart"/>
+      <w:r>
+        <w:rPr>
+          <w:rFonts w:ascii="TH Sarabun New" w:hAnsi="TH Sarabun New" w:cs="TH Sarabun New"/>
+          <w:sz w:val="28"/>
+          <w:szCs w:val="28"/>
+        </w:rPr>
+        <w:t>author_name_list</w:t>
+      </w:r>
+      <w:proofErr w:type="spellEnd"/>
+      <w:r>
+        <w:rPr>
+          <w:rFonts w:ascii="TH Sarabun New" w:hAnsi="TH Sarabun New" w:cs="TH Sarabun New"/>
+          <w:sz w:val="28"/>
+          <w:szCs w:val="28"/>
+        </w:rPr>
+        <w:t>}}</w:t>
+      </w:r>
+      <w:r>
+        <w:rPr>
+          <w:rFonts w:ascii="TH Sarabun New" w:hAnsi="TH Sarabun New" w:cs="TH Sarabun New"/>
+          <w:sz w:val="28"/>
+          <w:szCs w:val="28"/>
+        </w:rPr>
+        <w:t xml:space="preserve"> {{</w:t>
+      </w:r>
+      <w:proofErr w:type="spellStart"/>
+      <w:r>
+        <w:rPr>
+          <w:rFonts w:ascii="TH Sarabun New" w:hAnsi="TH Sarabun New" w:cs="TH Sarabun New"/>
+          <w:sz w:val="28"/>
+          <w:szCs w:val="28"/>
+        </w:rPr>
+        <w:t>paper_title</w:t>
+      </w:r>
+      <w:proofErr w:type="spellEnd"/>
+      <w:r>
+        <w:rPr>
+          <w:rFonts w:ascii="TH Sarabun New" w:hAnsi="TH Sarabun New" w:cs="TH Sarabun New"/>
+          <w:sz w:val="28"/>
+          <w:szCs w:val="28"/>
+        </w:rPr>
+        <w:t>}} {{</w:t>
+      </w:r>
+      <w:proofErr w:type="spellStart"/>
+      <w:r>
+        <w:rPr>
+          <w:rFonts w:ascii="TH Sarabun New" w:hAnsi="TH Sarabun New" w:cs="TH Sarabun New"/>
+          <w:sz w:val="28"/>
+          <w:szCs w:val="28"/>
+        </w:rPr>
+        <w:t>journal_name</w:t>
+      </w:r>
+      <w:proofErr w:type="spellEnd"/>
+      <w:r>
+        <w:rPr>
+          <w:rFonts w:ascii="TH Sarabun New" w:hAnsi="TH Sarabun New" w:cs="TH Sarabun New"/>
+          <w:sz w:val="28"/>
+          <w:szCs w:val="28"/>
+        </w:rPr>
+        <w:t>}} {{</w:t>
+      </w:r>
+      <w:proofErr w:type="spellStart"/>
+      <w:r>
+        <w:rPr>
+          <w:rFonts w:ascii="TH Sarabun New" w:hAnsi="TH Sarabun New" w:cs="TH Sarabun New"/>
+          <w:sz w:val="28"/>
+          <w:szCs w:val="28"/>
+        </w:rPr>
+        <w:t>publication_year</w:t>
+      </w:r>
+      <w:proofErr w:type="spellEnd"/>
+      <w:r>
+        <w:rPr>
+          <w:rFonts w:ascii="TH Sarabun New" w:hAnsi="TH Sarabun New" w:cs="TH Sarabun New"/>
+          <w:sz w:val="28"/>
+          <w:szCs w:val="28"/>
+        </w:rPr>
+        <w:t>}} {{</w:t>
+      </w:r>
+      <w:proofErr w:type="spellStart"/>
+      <w:r>
+        <w:rPr>
+          <w:rFonts w:ascii="TH Sarabun New" w:hAnsi="TH Sarabun New" w:cs="TH Sarabun New"/>
+          <w:sz w:val="28"/>
+          <w:szCs w:val="28"/>
+        </w:rPr>
+        <w:t>volum</w:t>
       </w:r>
       <w:r>
         <w:rPr>
@@ -898,7 +1061,34 @@
           <w:sz w:val="28"/>
           <w:szCs w:val="28"/>
         </w:rPr>
-        <w:t>_issue}} {{page_number}}</w:t>
+        <w:t>_issue</w:t>
+      </w:r>
+      <w:proofErr w:type="spellEnd"/>
+      <w:r>
+        <w:rPr>
+          <w:rFonts w:ascii="TH Sarabun New" w:hAnsi="TH Sarabun New" w:cs="TH Sarabun New"/>
+          <w:sz w:val="28"/>
+          <w:szCs w:val="28"/>
+        </w:rPr>
+        <w:t>}} {{</w:t>
+      </w:r>
+      <w:proofErr w:type="spellStart"/>
+      <w:r>
+        <w:rPr>
+          <w:rFonts w:ascii="TH Sarabun New" w:hAnsi="TH Sarabun New" w:cs="TH Sarabun New"/>
+          <w:sz w:val="28"/>
+          <w:szCs w:val="28"/>
+        </w:rPr>
+        <w:t>page_number</w:t>
+      </w:r>
+      <w:proofErr w:type="spellEnd"/>
+      <w:r>
+        <w:rPr>
+          <w:rFonts w:ascii="TH Sarabun New" w:hAnsi="TH Sarabun New" w:cs="TH Sarabun New"/>
+          <w:sz w:val="28"/>
+          <w:szCs w:val="28"/>
+        </w:rPr>
+        <w:t>}}</w:t>
       </w:r>
     </w:p>
     <w:p>
@@ -927,7 +1117,25 @@
           <w:sz w:val="28"/>
           <w:szCs w:val="28"/>
         </w:rPr>
-        <w:t>{{author_role}}</w:t>
+        <w:t>{{</w:t>
+      </w:r>
+      <w:proofErr w:type="spellStart"/>
+      <w:r>
+        <w:rPr>
+          <w:rFonts w:ascii="TH Sarabun New" w:hAnsi="TH Sarabun New" w:cs="TH Sarabun New"/>
+          <w:sz w:val="28"/>
+          <w:szCs w:val="28"/>
+        </w:rPr>
+        <w:t>author_role</w:t>
+      </w:r>
+      <w:proofErr w:type="spellEnd"/>
+      <w:r>
+        <w:rPr>
+          <w:rFonts w:ascii="TH Sarabun New" w:hAnsi="TH Sarabun New" w:cs="TH Sarabun New"/>
+          <w:sz w:val="28"/>
+          <w:szCs w:val="28"/>
+        </w:rPr>
+        <w:t>}}</w:t>
       </w:r>
       <w:r>
         <w:rPr>
@@ -953,7 +1161,16 @@
           <w:sz w:val="28"/>
           <w:szCs w:val="28"/>
         </w:rPr>
-        <w:t xml:space="preserve"> {{quartile</w:t>
+        <w:t xml:space="preserve"> {{</w:t>
+      </w:r>
+      <w:proofErr w:type="spellStart"/>
+      <w:r>
+        <w:rPr>
+          <w:rFonts w:ascii="TH Sarabun New" w:hAnsi="TH Sarabun New" w:cs="TH Sarabun New"/>
+          <w:sz w:val="28"/>
+          <w:szCs w:val="28"/>
+        </w:rPr>
+        <w:t>quartile</w:t>
       </w:r>
       <w:r>
         <w:rPr>
@@ -963,6 +1180,7 @@
         </w:rPr>
         <w:t>_line</w:t>
       </w:r>
+      <w:proofErr w:type="spellEnd"/>
       <w:r>
         <w:rPr>
           <w:rFonts w:ascii="TH Sarabun New" w:hAnsi="TH Sarabun New" w:cs="TH Sarabun New"/>
@@ -1042,12 +1260,11 @@
     </w:p>
     <w:p>
       <w:pPr>
-        <w:ind w:right="43" w:firstLine="720"/>
-        <w:rPr>
-          <w:rFonts w:ascii="TH Sarabun New" w:hAnsi="TH Sarabun New" w:cs="TH Sarabun New" w:hint="cs"/>
-          <w:sz w:val="28"/>
-          <w:szCs w:val="28"/>
-          <w:cs/>
+        <w:ind w:left="720" w:right="43" w:firstLine="720"/>
+        <w:rPr>
+          <w:rFonts w:ascii="TH Sarabun New" w:hAnsi="TH Sarabun New" w:cs="TH Sarabun New"/>
+          <w:sz w:val="28"/>
+          <w:szCs w:val="28"/>
         </w:rPr>
       </w:pPr>
       <w:r>
@@ -1056,16 +1273,26 @@
           <w:color w:val="000000"/>
           <w:sz w:val="28"/>
         </w:rPr>
-        <w:t>{{document</w:t>
-      </w:r>
+        <w:t>{{</w:t>
+      </w:r>
+      <w:proofErr w:type="spellStart"/>
       <w:r>
         <w:rPr>
           <w:rFonts w:ascii="TH Sarabun New" w:hAnsi="TH Sarabun New" w:cs="TH Sarabun New"/>
           <w:color w:val="000000"/>
           <w:sz w:val="28"/>
         </w:rPr>
+        <w:t>document</w:t>
+      </w:r>
+      <w:r>
+        <w:rPr>
+          <w:rFonts w:ascii="TH Sarabun New" w:hAnsi="TH Sarabun New" w:cs="TH Sarabun New"/>
+          <w:color w:val="000000"/>
+          <w:sz w:val="28"/>
+        </w:rPr>
         <w:t>_line</w:t>
       </w:r>
+      <w:proofErr w:type="spellEnd"/>
       <w:r>
         <w:rPr>
           <w:rFonts w:ascii="TH Sarabun New" w:hAnsi="TH Sarabun New" w:cs="TH Sarabun New"/>
@@ -1078,7 +1305,7 @@
     <w:p>
       <w:pPr>
         <w:rPr>
-          <w:rFonts w:ascii="TH Sarabun New" w:hAnsi="TH Sarabun New" w:cs="TH Sarabun New"/>
+          <w:rFonts w:ascii="TH Sarabun New" w:hAnsi="TH Sarabun New" w:cs="TH Sarabun New" w:hint="cs"/>
           <w:sz w:val="28"/>
           <w:szCs w:val="28"/>
           <w:cs/>
@@ -1300,7 +1527,25 @@
           <w:sz w:val="28"/>
           <w:szCs w:val="28"/>
         </w:rPr>
-        <w:t xml:space="preserve">{{kku_report_year}} </w:t>
+        <w:t>{{</w:t>
+      </w:r>
+      <w:proofErr w:type="spellStart"/>
+      <w:r>
+        <w:rPr>
+          <w:rFonts w:ascii="TH Sarabun New" w:hAnsi="TH Sarabun New" w:cs="TH Sarabun New"/>
+          <w:sz w:val="28"/>
+          <w:szCs w:val="28"/>
+        </w:rPr>
+        <w:t>kku_report_year</w:t>
+      </w:r>
+      <w:proofErr w:type="spellEnd"/>
+      <w:r>
+        <w:rPr>
+          <w:rFonts w:ascii="TH Sarabun New" w:hAnsi="TH Sarabun New" w:cs="TH Sarabun New"/>
+          <w:sz w:val="28"/>
+          <w:szCs w:val="28"/>
+        </w:rPr>
+        <w:t xml:space="preserve">}} </w:t>
       </w:r>
       <w:r>
         <w:rPr>
@@ -1466,7 +1711,25 @@
           <w:sz w:val="28"/>
           <w:szCs w:val="28"/>
         </w:rPr>
-        <w:t>{{applicant_name}}</w:t>
+        <w:t>{{</w:t>
+      </w:r>
+      <w:proofErr w:type="spellStart"/>
+      <w:r>
+        <w:rPr>
+          <w:rFonts w:ascii="TH Sarabun New" w:hAnsi="TH Sarabun New" w:cs="TH Sarabun New"/>
+          <w:sz w:val="28"/>
+          <w:szCs w:val="28"/>
+        </w:rPr>
+        <w:t>applicant_name</w:t>
+      </w:r>
+      <w:proofErr w:type="spellEnd"/>
+      <w:r>
+        <w:rPr>
+          <w:rFonts w:ascii="TH Sarabun New" w:hAnsi="TH Sarabun New" w:cs="TH Sarabun New"/>
+          <w:sz w:val="28"/>
+          <w:szCs w:val="28"/>
+        </w:rPr>
+        <w:t>}}</w:t>
       </w:r>
       <w:r>
         <w:rPr>
@@ -1475,6 +1738,359 @@
           <w:szCs w:val="28"/>
         </w:rPr>
         <w:t>)</w:t>
+      </w:r>
+    </w:p>
+    <w:p>
+      <w:pPr>
+        <w:tabs>
+          <w:tab w:val="center" w:pos="5670"/>
+        </w:tabs>
+        <w:jc w:val="thaiDistribute"/>
+        <w:rPr>
+          <w:rFonts w:ascii="TH Sarabun New" w:hAnsi="TH Sarabun New" w:cs="TH Sarabun New"/>
+          <w:sz w:val="28"/>
+          <w:szCs w:val="28"/>
+        </w:rPr>
+      </w:pPr>
+    </w:p>
+    <w:p>
+      <w:pPr>
+        <w:ind w:right="-226"/>
+        <w:jc w:val="thaiDistribute"/>
+        <w:rPr>
+          <w:rFonts w:ascii="TH Sarabun New" w:hAnsi="TH Sarabun New" w:cs="TH Sarabun New"/>
+          <w:b/>
+          <w:bCs/>
+          <w:sz w:val="28"/>
+          <w:szCs w:val="28"/>
+        </w:rPr>
+      </w:pPr>
+      <w:r>
+        <w:rPr>
+          <w:rFonts w:ascii="TH Sarabun New" w:hAnsi="TH Sarabun New" w:cs="TH Sarabun New"/>
+          <w:b/>
+          <w:bCs/>
+          <w:sz w:val="28"/>
+          <w:szCs w:val="28"/>
+          <w:cs/>
+        </w:rPr>
+        <w:t>คำ</w:t>
+      </w:r>
+      <w:r>
+        <w:rPr>
+          <w:rFonts w:ascii="TH Sarabun New" w:hAnsi="TH Sarabun New" w:cs="TH Sarabun New" w:hint="cs"/>
+          <w:b/>
+          <w:bCs/>
+          <w:sz w:val="28"/>
+          <w:szCs w:val="28"/>
+          <w:cs/>
+        </w:rPr>
+        <w:t>เห็น</w:t>
+      </w:r>
+      <w:r>
+        <w:rPr>
+          <w:rFonts w:ascii="TH Sarabun New" w:hAnsi="TH Sarabun New" w:cs="TH Sarabun New"/>
+          <w:b/>
+          <w:bCs/>
+          <w:sz w:val="28"/>
+          <w:szCs w:val="28"/>
+          <w:cs/>
+        </w:rPr>
+        <w:t>ของหัวหน้าสาขา</w:t>
+      </w:r>
+      <w:r>
+        <w:rPr>
+          <w:rFonts w:ascii="TH Sarabun New" w:hAnsi="TH Sarabun New" w:cs="TH Sarabun New"/>
+          <w:b/>
+          <w:bCs/>
+          <w:sz w:val="28"/>
+          <w:szCs w:val="28"/>
+          <w:cs/>
+        </w:rPr>
+        <w:t xml:space="preserve">วิชา </w:t>
+      </w:r>
+    </w:p>
+    <w:p>
+      <w:pPr>
+        <w:ind w:right="-5"/>
+        <w:rPr>
+          <w:rFonts w:ascii="TH Sarabun New" w:hAnsi="TH Sarabun New" w:cs="TH Sarabun New"/>
+          <w:sz w:val="28"/>
+          <w:szCs w:val="28"/>
+        </w:rPr>
+      </w:pPr>
+      <w:r>
+        <w:rPr>
+          <w:rFonts w:ascii="TH Sarabun New" w:hAnsi="TH Sarabun New" w:cs="TH Sarabun New"/>
+          <w:sz w:val="28"/>
+          <w:szCs w:val="28"/>
+        </w:rPr>
+        <w:t>{{</w:t>
+      </w:r>
+      <w:proofErr w:type="spellStart"/>
+      <w:r>
+        <w:rPr>
+          <w:rFonts w:ascii="TH Sarabun New" w:hAnsi="TH Sarabun New" w:cs="TH Sarabun New"/>
+          <w:sz w:val="28"/>
+          <w:szCs w:val="28"/>
+        </w:rPr>
+        <w:t>head_comment</w:t>
+      </w:r>
+      <w:proofErr w:type="spellEnd"/>
+      <w:r>
+        <w:rPr>
+          <w:rFonts w:ascii="TH Sarabun New" w:hAnsi="TH Sarabun New" w:cs="TH Sarabun New"/>
+          <w:sz w:val="28"/>
+          <w:szCs w:val="28"/>
+        </w:rPr>
+        <w:t>}}</w:t>
+      </w:r>
+    </w:p>
+    <w:p>
+      <w:pPr>
+        <w:ind w:right="-5"/>
+        <w:rPr>
+          <w:rFonts w:ascii="TH Sarabun New" w:hAnsi="TH Sarabun New" w:cs="TH Sarabun New" w:hint="cs"/>
+          <w:sz w:val="28"/>
+          <w:szCs w:val="28"/>
+          <w:cs/>
+        </w:rPr>
+      </w:pPr>
+    </w:p>
+    <w:p>
+      <w:pPr>
+        <w:ind w:left="3261" w:firstLine="720"/>
+        <w:jc w:val="thaiDistribute"/>
+        <w:rPr>
+          <w:rFonts w:ascii="TH Sarabun New" w:hAnsi="TH Sarabun New" w:cs="TH Sarabun New"/>
+          <w:sz w:val="28"/>
+          <w:szCs w:val="28"/>
+        </w:rPr>
+      </w:pPr>
+    </w:p>
+    <w:p>
+      <w:pPr>
+        <w:tabs>
+          <w:tab w:val="center" w:pos="5670"/>
+        </w:tabs>
+        <w:jc w:val="thaiDistribute"/>
+        <w:rPr>
+          <w:rFonts w:ascii="TH Sarabun New" w:hAnsi="TH Sarabun New" w:cs="TH Sarabun New"/>
+          <w:sz w:val="28"/>
+          <w:szCs w:val="28"/>
+        </w:rPr>
+      </w:pPr>
+      <w:r>
+        <w:rPr>
+          <w:rFonts w:ascii="TH Sarabun New" w:hAnsi="TH Sarabun New" w:cs="TH Sarabun New"/>
+          <w:sz w:val="28"/>
+          <w:szCs w:val="28"/>
+          <w:cs/>
+        </w:rPr>
+        <w:tab/>
+      </w:r>
+      <w:r>
+        <w:rPr>
+          <w:rFonts w:ascii="TH Sarabun New" w:hAnsi="TH Sarabun New" w:cs="TH Sarabun New"/>
+          <w:sz w:val="28"/>
+          <w:szCs w:val="28"/>
+        </w:rPr>
+        <w:t>(</w:t>
+      </w:r>
+      <w:r>
+        <w:rPr>
+          <w:rFonts w:ascii="TH Sarabun New" w:hAnsi="TH Sarabun New" w:cs="TH Sarabun New"/>
+          <w:sz w:val="28"/>
+          <w:szCs w:val="28"/>
+          <w:cs/>
+        </w:rPr>
+        <w:t>ลงชื่อ</w:t>
+      </w:r>
+      <w:r>
+        <w:rPr>
+          <w:rFonts w:ascii="TH Sarabun New" w:hAnsi="TH Sarabun New" w:cs="TH Sarabun New"/>
+          <w:sz w:val="28"/>
+          <w:szCs w:val="28"/>
+        </w:rPr>
+        <w:t xml:space="preserve">) </w:t>
+      </w:r>
+      <w:r>
+        <w:rPr>
+          <w:rFonts w:ascii="TH Sarabun New" w:hAnsi="TH Sarabun New" w:cs="TH Sarabun New"/>
+          <w:sz w:val="28"/>
+          <w:szCs w:val="28"/>
+        </w:rPr>
+        <w:t>{{</w:t>
+      </w:r>
+      <w:proofErr w:type="spellStart"/>
+      <w:r>
+        <w:rPr>
+          <w:rFonts w:ascii="TH Sarabun New" w:hAnsi="TH Sarabun New" w:cs="TH Sarabun New"/>
+          <w:sz w:val="28"/>
+          <w:szCs w:val="28"/>
+        </w:rPr>
+        <w:t>head_signature</w:t>
+      </w:r>
+      <w:proofErr w:type="spellEnd"/>
+      <w:r>
+        <w:rPr>
+          <w:rFonts w:ascii="TH Sarabun New" w:hAnsi="TH Sarabun New" w:cs="TH Sarabun New"/>
+          <w:sz w:val="28"/>
+          <w:szCs w:val="28"/>
+        </w:rPr>
+        <w:t>}}</w:t>
+      </w:r>
+    </w:p>
+    <w:p>
+      <w:pPr>
+        <w:tabs>
+          <w:tab w:val="center" w:pos="5670"/>
+        </w:tabs>
+        <w:jc w:val="thaiDistribute"/>
+        <w:rPr>
+          <w:rFonts w:ascii="TH Sarabun New" w:hAnsi="TH Sarabun New" w:cs="TH Sarabun New"/>
+          <w:sz w:val="28"/>
+          <w:szCs w:val="28"/>
+        </w:rPr>
+      </w:pPr>
+      <w:r>
+        <w:rPr>
+          <w:rFonts w:ascii="TH Sarabun New" w:hAnsi="TH Sarabun New" w:cs="TH Sarabun New"/>
+          <w:sz w:val="28"/>
+          <w:szCs w:val="28"/>
+          <w:cs/>
+        </w:rPr>
+        <w:tab/>
+      </w:r>
+      <w:r>
+        <w:rPr>
+          <w:rFonts w:ascii="TH Sarabun New" w:hAnsi="TH Sarabun New" w:cs="TH Sarabun New"/>
+          <w:sz w:val="28"/>
+          <w:szCs w:val="28"/>
+        </w:rPr>
+        <w:t>(</w:t>
+      </w:r>
+      <w:r>
+        <w:rPr>
+          <w:rFonts w:ascii="TH Sarabun New" w:hAnsi="TH Sarabun New" w:cs="TH Sarabun New"/>
+          <w:sz w:val="28"/>
+          <w:szCs w:val="28"/>
+        </w:rPr>
+        <w:t>{{</w:t>
+      </w:r>
+      <w:proofErr w:type="spellStart"/>
+      <w:r>
+        <w:rPr>
+          <w:rFonts w:ascii="TH Sarabun New" w:hAnsi="TH Sarabun New" w:cs="TH Sarabun New"/>
+          <w:sz w:val="28"/>
+          <w:szCs w:val="28"/>
+        </w:rPr>
+        <w:t>head_name</w:t>
+      </w:r>
+      <w:proofErr w:type="spellEnd"/>
+      <w:r>
+        <w:rPr>
+          <w:rFonts w:ascii="TH Sarabun New" w:hAnsi="TH Sarabun New" w:cs="TH Sarabun New"/>
+          <w:sz w:val="28"/>
+          <w:szCs w:val="28"/>
+        </w:rPr>
+        <w:t>}}</w:t>
+      </w:r>
+      <w:r>
+        <w:rPr>
+          <w:rFonts w:ascii="TH Sarabun New" w:hAnsi="TH Sarabun New" w:cs="TH Sarabun New"/>
+          <w:sz w:val="28"/>
+          <w:szCs w:val="28"/>
+        </w:rPr>
+        <w:t>)</w:t>
+      </w:r>
+    </w:p>
+    <w:p>
+      <w:pPr>
+        <w:tabs>
+          <w:tab w:val="center" w:pos="5670"/>
+        </w:tabs>
+        <w:jc w:val="thaiDistribute"/>
+        <w:rPr>
+          <w:rFonts w:ascii="TH Sarabun New" w:hAnsi="TH Sarabun New" w:cs="TH Sarabun New"/>
+          <w:sz w:val="28"/>
+          <w:szCs w:val="28"/>
+        </w:rPr>
+      </w:pPr>
+      <w:r>
+        <w:rPr>
+          <w:rFonts w:ascii="TH Sarabun New" w:hAnsi="TH Sarabun New" w:cs="TH Sarabun New"/>
+          <w:sz w:val="28"/>
+          <w:szCs w:val="28"/>
+          <w:cs/>
+        </w:rPr>
+        <w:tab/>
+      </w:r>
+      <w:r>
+        <w:rPr>
+          <w:rFonts w:ascii="TH Sarabun New" w:hAnsi="TH Sarabun New" w:cs="TH Sarabun New"/>
+          <w:sz w:val="28"/>
+          <w:szCs w:val="28"/>
+          <w:cs/>
+        </w:rPr>
+        <w:t xml:space="preserve">ตำแหน่ง </w:t>
+      </w:r>
+      <w:r>
+        <w:rPr>
+          <w:rFonts w:ascii="TH Sarabun New" w:hAnsi="TH Sarabun New" w:cs="TH Sarabun New" w:hint="cs"/>
+          <w:sz w:val="28"/>
+          <w:szCs w:val="28"/>
+          <w:cs/>
+        </w:rPr>
+        <w:t>หัวหน้าสาขาวิชาวิทยาการคอมพิวเตอร์</w:t>
+      </w:r>
+    </w:p>
+    <w:p>
+      <w:pPr>
+        <w:tabs>
+          <w:tab w:val="center" w:pos="5670"/>
+        </w:tabs>
+        <w:jc w:val="thaiDistribute"/>
+        <w:rPr>
+          <w:rFonts w:ascii="TH Sarabun New" w:hAnsi="TH Sarabun New" w:cs="TH Sarabun New"/>
+          <w:sz w:val="28"/>
+          <w:szCs w:val="28"/>
+        </w:rPr>
+      </w:pPr>
+      <w:r>
+        <w:rPr>
+          <w:rFonts w:ascii="TH Sarabun New" w:hAnsi="TH Sarabun New" w:cs="TH Sarabun New"/>
+          <w:sz w:val="28"/>
+          <w:szCs w:val="28"/>
+          <w:cs/>
+        </w:rPr>
+        <w:tab/>
+      </w:r>
+      <w:r>
+        <w:rPr>
+          <w:rFonts w:ascii="TH Sarabun New" w:hAnsi="TH Sarabun New" w:cs="TH Sarabun New"/>
+          <w:sz w:val="28"/>
+          <w:szCs w:val="28"/>
+        </w:rPr>
+        <w:t>{{</w:t>
+      </w:r>
+      <w:proofErr w:type="spellStart"/>
+      <w:r>
+        <w:rPr>
+          <w:rFonts w:ascii="TH Sarabun New" w:hAnsi="TH Sarabun New" w:cs="TH Sarabun New"/>
+          <w:sz w:val="28"/>
+          <w:szCs w:val="28"/>
+        </w:rPr>
+        <w:t>head_approved_date</w:t>
+      </w:r>
+      <w:proofErr w:type="spellEnd"/>
+      <w:r>
+        <w:rPr>
+          <w:rFonts w:ascii="TH Sarabun New" w:hAnsi="TH Sarabun New" w:cs="TH Sarabun New"/>
+          <w:sz w:val="28"/>
+          <w:szCs w:val="28"/>
+        </w:rPr>
+        <w:t>}}</w:t>
       </w:r>
     </w:p>
     <w:sectPr>
@@ -1678,8 +2294,19 @@
         <w:szCs w:val="28"/>
         <w:cs/>
       </w:rPr>
-      <w:t xml:space="preserve"> กท</w:t>
+      <w:t xml:space="preserve"> </w:t>
     </w:r>
+    <w:proofErr w:type="spellStart"/>
+    <w:r>
+      <w:rPr>
+        <w:rFonts w:ascii="Angsana New" w:hAnsi="Angsana New"/>
+        <w:sz w:val="28"/>
+        <w:szCs w:val="28"/>
+        <w:cs/>
+      </w:rPr>
+      <w:t>กท</w:t>
+    </w:r>
+    <w:proofErr w:type="spellEnd"/>
     <w:r>
       <w:rPr>
         <w:rFonts w:ascii="Angsana New" w:hAnsi="Angsana New" w:hint="cs"/>

</xml_diff>

<commit_message>
Squashed 'fund-management-api/' changes from 61bf16f..113d3a5
113d3a5 change docx template back
ae9b018 Use submission folder type for merged files
b086cee Fix merged PDF lookup for submission documents
9a583c0 attach system announcements to fund submissions
f30071d Add diagnostics for submission PDF merges
27c1d71 Normalize stored paths before merging submission PDFs

git-subtree-dir: fund-management-api
git-subtree-split: 113d3a5fffbfa557d9fd100b0927dc6adc7e3b25
</commit_message>
<xml_diff>
--- a/templates/publication_reward_template.docx
+++ b/templates/publication_reward_template.docx
@@ -211,25 +211,7 @@
           <w:sz w:val="28"/>
           <w:szCs w:val="28"/>
         </w:rPr>
-        <w:t>{{</w:t>
-      </w:r>
-      <w:proofErr w:type="spellStart"/>
-      <w:r>
-        <w:rPr>
-          <w:rFonts w:ascii="TH Sarabun New" w:hAnsi="TH Sarabun New" w:cs="TH Sarabun New"/>
-          <w:sz w:val="28"/>
-          <w:szCs w:val="28"/>
-        </w:rPr>
-        <w:t>date_th</w:t>
-      </w:r>
-      <w:proofErr w:type="spellEnd"/>
-      <w:r>
-        <w:rPr>
-          <w:rFonts w:ascii="TH Sarabun New" w:hAnsi="TH Sarabun New" w:cs="TH Sarabun New"/>
-          <w:sz w:val="28"/>
-          <w:szCs w:val="28"/>
-        </w:rPr>
-        <w:t>}}</w:t>
+        <w:t>{{date_th}}</w:t>
       </w:r>
     </w:p>
     <w:p>
@@ -355,25 +337,7 @@
           <w:sz w:val="28"/>
           <w:szCs w:val="28"/>
         </w:rPr>
-        <w:t>{{</w:t>
-      </w:r>
-      <w:proofErr w:type="spellStart"/>
-      <w:r>
-        <w:rPr>
-          <w:rFonts w:ascii="TH Sarabun New" w:hAnsi="TH Sarabun New" w:cs="TH Sarabun New"/>
-          <w:sz w:val="28"/>
-          <w:szCs w:val="28"/>
-        </w:rPr>
-        <w:t>applicant_name</w:t>
-      </w:r>
-      <w:proofErr w:type="spellEnd"/>
-      <w:r>
-        <w:rPr>
-          <w:rFonts w:ascii="TH Sarabun New" w:hAnsi="TH Sarabun New" w:cs="TH Sarabun New"/>
-          <w:sz w:val="28"/>
-          <w:szCs w:val="28"/>
-        </w:rPr>
-        <w:t>}}</w:t>
+        <w:t>{{applicant_name}}</w:t>
       </w:r>
       <w:r>
         <w:rPr>
@@ -407,25 +371,7 @@
           <w:sz w:val="28"/>
           <w:szCs w:val="28"/>
         </w:rPr>
-        <w:t>{{</w:t>
-      </w:r>
-      <w:proofErr w:type="spellStart"/>
-      <w:r>
-        <w:rPr>
-          <w:rFonts w:ascii="TH Sarabun New" w:hAnsi="TH Sarabun New" w:cs="TH Sarabun New"/>
-          <w:sz w:val="28"/>
-          <w:szCs w:val="28"/>
-        </w:rPr>
-        <w:t>date_of_employment</w:t>
-      </w:r>
-      <w:proofErr w:type="spellEnd"/>
-      <w:r>
-        <w:rPr>
-          <w:rFonts w:ascii="TH Sarabun New" w:hAnsi="TH Sarabun New" w:cs="TH Sarabun New"/>
-          <w:sz w:val="28"/>
-          <w:szCs w:val="28"/>
-        </w:rPr>
-        <w:t>}}</w:t>
+        <w:t>{{date_of_employment}}</w:t>
       </w:r>
       <w:r>
         <w:rPr>
@@ -733,25 +679,7 @@
           <w:sz w:val="28"/>
           <w:szCs w:val="28"/>
         </w:rPr>
-        <w:t>{{</w:t>
-      </w:r>
-      <w:proofErr w:type="spellStart"/>
-      <w:r>
-        <w:rPr>
-          <w:rFonts w:ascii="TH Sarabun New" w:hAnsi="TH Sarabun New" w:cs="TH Sarabun New"/>
-          <w:sz w:val="28"/>
-          <w:szCs w:val="28"/>
-        </w:rPr>
-        <w:t>total_amount</w:t>
-      </w:r>
-      <w:proofErr w:type="spellEnd"/>
-      <w:r>
-        <w:rPr>
-          <w:rFonts w:ascii="TH Sarabun New" w:hAnsi="TH Sarabun New" w:cs="TH Sarabun New"/>
-          <w:sz w:val="28"/>
-          <w:szCs w:val="28"/>
-        </w:rPr>
-        <w:t xml:space="preserve">}} </w:t>
+        <w:t xml:space="preserve">{{total_amount}} </w:t>
       </w:r>
       <w:r>
         <w:rPr>
@@ -784,16 +712,7 @@
           <w:sz w:val="28"/>
           <w:szCs w:val="28"/>
         </w:rPr>
-        <w:t>{{</w:t>
-      </w:r>
-      <w:proofErr w:type="spellStart"/>
-      <w:r>
-        <w:rPr>
-          <w:rFonts w:ascii="TH Sarabun New" w:hAnsi="TH Sarabun New" w:cs="TH Sarabun New"/>
-          <w:sz w:val="28"/>
-          <w:szCs w:val="28"/>
-        </w:rPr>
-        <w:t>total_amount_</w:t>
+        <w:t>{{total_amount_</w:t>
       </w:r>
       <w:r>
         <w:rPr>
@@ -803,7 +722,6 @@
         </w:rPr>
         <w:t>text</w:t>
       </w:r>
-      <w:proofErr w:type="spellEnd"/>
       <w:r>
         <w:rPr>
           <w:rFonts w:ascii="TH Sarabun New" w:hAnsi="TH Sarabun New" w:cs="TH Sarabun New"/>
@@ -956,96 +874,15 @@
           <w:sz w:val="28"/>
           <w:szCs w:val="28"/>
         </w:rPr>
-        <w:t>{{</w:t>
-      </w:r>
-      <w:proofErr w:type="spellStart"/>
-      <w:r>
-        <w:rPr>
-          <w:rFonts w:ascii="TH Sarabun New" w:hAnsi="TH Sarabun New" w:cs="TH Sarabun New"/>
-          <w:sz w:val="28"/>
-          <w:szCs w:val="28"/>
-        </w:rPr>
-        <w:t>author_name_list</w:t>
-      </w:r>
-      <w:proofErr w:type="spellEnd"/>
-      <w:r>
-        <w:rPr>
-          <w:rFonts w:ascii="TH Sarabun New" w:hAnsi="TH Sarabun New" w:cs="TH Sarabun New"/>
-          <w:sz w:val="28"/>
-          <w:szCs w:val="28"/>
-        </w:rPr>
-        <w:t>}}</w:t>
-      </w:r>
-      <w:r>
-        <w:rPr>
-          <w:rFonts w:ascii="TH Sarabun New" w:hAnsi="TH Sarabun New" w:cs="TH Sarabun New"/>
-          <w:sz w:val="28"/>
-          <w:szCs w:val="28"/>
-        </w:rPr>
-        <w:t xml:space="preserve"> {{</w:t>
-      </w:r>
-      <w:proofErr w:type="spellStart"/>
-      <w:r>
-        <w:rPr>
-          <w:rFonts w:ascii="TH Sarabun New" w:hAnsi="TH Sarabun New" w:cs="TH Sarabun New"/>
-          <w:sz w:val="28"/>
-          <w:szCs w:val="28"/>
-        </w:rPr>
-        <w:t>paper_title</w:t>
-      </w:r>
-      <w:proofErr w:type="spellEnd"/>
-      <w:r>
-        <w:rPr>
-          <w:rFonts w:ascii="TH Sarabun New" w:hAnsi="TH Sarabun New" w:cs="TH Sarabun New"/>
-          <w:sz w:val="28"/>
-          <w:szCs w:val="28"/>
-        </w:rPr>
-        <w:t>}} {{</w:t>
-      </w:r>
-      <w:proofErr w:type="spellStart"/>
-      <w:r>
-        <w:rPr>
-          <w:rFonts w:ascii="TH Sarabun New" w:hAnsi="TH Sarabun New" w:cs="TH Sarabun New"/>
-          <w:sz w:val="28"/>
-          <w:szCs w:val="28"/>
-        </w:rPr>
-        <w:t>journal_name</w:t>
-      </w:r>
-      <w:proofErr w:type="spellEnd"/>
-      <w:r>
-        <w:rPr>
-          <w:rFonts w:ascii="TH Sarabun New" w:hAnsi="TH Sarabun New" w:cs="TH Sarabun New"/>
-          <w:sz w:val="28"/>
-          <w:szCs w:val="28"/>
-        </w:rPr>
-        <w:t>}} {{</w:t>
-      </w:r>
-      <w:proofErr w:type="spellStart"/>
-      <w:r>
-        <w:rPr>
-          <w:rFonts w:ascii="TH Sarabun New" w:hAnsi="TH Sarabun New" w:cs="TH Sarabun New"/>
-          <w:sz w:val="28"/>
-          <w:szCs w:val="28"/>
-        </w:rPr>
-        <w:t>publication_year</w:t>
-      </w:r>
-      <w:proofErr w:type="spellEnd"/>
-      <w:r>
-        <w:rPr>
-          <w:rFonts w:ascii="TH Sarabun New" w:hAnsi="TH Sarabun New" w:cs="TH Sarabun New"/>
-          <w:sz w:val="28"/>
-          <w:szCs w:val="28"/>
-        </w:rPr>
-        <w:t>}} {{</w:t>
-      </w:r>
-      <w:proofErr w:type="spellStart"/>
-      <w:r>
-        <w:rPr>
-          <w:rFonts w:ascii="TH Sarabun New" w:hAnsi="TH Sarabun New" w:cs="TH Sarabun New"/>
-          <w:sz w:val="28"/>
-          <w:szCs w:val="28"/>
-        </w:rPr>
-        <w:t>volum</w:t>
+        <w:t>{{author_name_list}}</w:t>
+      </w:r>
+      <w:r>
+        <w:rPr>
+          <w:rFonts w:ascii="TH Sarabun New" w:hAnsi="TH Sarabun New" w:cs="TH Sarabun New"/>
+          <w:sz w:val="28"/>
+          <w:szCs w:val="28"/>
+        </w:rPr>
+        <w:t xml:space="preserve"> {{paper_title}} {{journal_name}} {{publication_year}} {{volum</w:t>
       </w:r>
       <w:r>
         <w:rPr>
@@ -1061,34 +898,7 @@
           <w:sz w:val="28"/>
           <w:szCs w:val="28"/>
         </w:rPr>
-        <w:t>_issue</w:t>
-      </w:r>
-      <w:proofErr w:type="spellEnd"/>
-      <w:r>
-        <w:rPr>
-          <w:rFonts w:ascii="TH Sarabun New" w:hAnsi="TH Sarabun New" w:cs="TH Sarabun New"/>
-          <w:sz w:val="28"/>
-          <w:szCs w:val="28"/>
-        </w:rPr>
-        <w:t>}} {{</w:t>
-      </w:r>
-      <w:proofErr w:type="spellStart"/>
-      <w:r>
-        <w:rPr>
-          <w:rFonts w:ascii="TH Sarabun New" w:hAnsi="TH Sarabun New" w:cs="TH Sarabun New"/>
-          <w:sz w:val="28"/>
-          <w:szCs w:val="28"/>
-        </w:rPr>
-        <w:t>page_number</w:t>
-      </w:r>
-      <w:proofErr w:type="spellEnd"/>
-      <w:r>
-        <w:rPr>
-          <w:rFonts w:ascii="TH Sarabun New" w:hAnsi="TH Sarabun New" w:cs="TH Sarabun New"/>
-          <w:sz w:val="28"/>
-          <w:szCs w:val="28"/>
-        </w:rPr>
-        <w:t>}}</w:t>
+        <w:t>_issue}} {{page_number}}</w:t>
       </w:r>
     </w:p>
     <w:p>
@@ -1117,25 +927,7 @@
           <w:sz w:val="28"/>
           <w:szCs w:val="28"/>
         </w:rPr>
-        <w:t>{{</w:t>
-      </w:r>
-      <w:proofErr w:type="spellStart"/>
-      <w:r>
-        <w:rPr>
-          <w:rFonts w:ascii="TH Sarabun New" w:hAnsi="TH Sarabun New" w:cs="TH Sarabun New"/>
-          <w:sz w:val="28"/>
-          <w:szCs w:val="28"/>
-        </w:rPr>
-        <w:t>author_role</w:t>
-      </w:r>
-      <w:proofErr w:type="spellEnd"/>
-      <w:r>
-        <w:rPr>
-          <w:rFonts w:ascii="TH Sarabun New" w:hAnsi="TH Sarabun New" w:cs="TH Sarabun New"/>
-          <w:sz w:val="28"/>
-          <w:szCs w:val="28"/>
-        </w:rPr>
-        <w:t>}}</w:t>
+        <w:t>{{author_role}}</w:t>
       </w:r>
       <w:r>
         <w:rPr>
@@ -1161,16 +953,7 @@
           <w:sz w:val="28"/>
           <w:szCs w:val="28"/>
         </w:rPr>
-        <w:t xml:space="preserve"> {{</w:t>
-      </w:r>
-      <w:proofErr w:type="spellStart"/>
-      <w:r>
-        <w:rPr>
-          <w:rFonts w:ascii="TH Sarabun New" w:hAnsi="TH Sarabun New" w:cs="TH Sarabun New"/>
-          <w:sz w:val="28"/>
-          <w:szCs w:val="28"/>
-        </w:rPr>
-        <w:t>quartile</w:t>
+        <w:t xml:space="preserve"> {{quartile</w:t>
       </w:r>
       <w:r>
         <w:rPr>
@@ -1180,7 +963,6 @@
         </w:rPr>
         <w:t>_line</w:t>
       </w:r>
-      <w:proofErr w:type="spellEnd"/>
       <w:r>
         <w:rPr>
           <w:rFonts w:ascii="TH Sarabun New" w:hAnsi="TH Sarabun New" w:cs="TH Sarabun New"/>
@@ -1260,11 +1042,12 @@
     </w:p>
     <w:p>
       <w:pPr>
-        <w:ind w:left="720" w:right="43" w:firstLine="720"/>
-        <w:rPr>
-          <w:rFonts w:ascii="TH Sarabun New" w:hAnsi="TH Sarabun New" w:cs="TH Sarabun New"/>
-          <w:sz w:val="28"/>
-          <w:szCs w:val="28"/>
+        <w:ind w:right="43" w:firstLine="720"/>
+        <w:rPr>
+          <w:rFonts w:ascii="TH Sarabun New" w:hAnsi="TH Sarabun New" w:cs="TH Sarabun New" w:hint="cs"/>
+          <w:sz w:val="28"/>
+          <w:szCs w:val="28"/>
+          <w:cs/>
         </w:rPr>
       </w:pPr>
       <w:r>
@@ -1273,26 +1056,16 @@
           <w:color w:val="000000"/>
           <w:sz w:val="28"/>
         </w:rPr>
-        <w:t>{{</w:t>
-      </w:r>
-      <w:proofErr w:type="spellStart"/>
+        <w:t>{{document</w:t>
+      </w:r>
       <w:r>
         <w:rPr>
           <w:rFonts w:ascii="TH Sarabun New" w:hAnsi="TH Sarabun New" w:cs="TH Sarabun New"/>
           <w:color w:val="000000"/>
           <w:sz w:val="28"/>
         </w:rPr>
-        <w:t>document</w:t>
-      </w:r>
-      <w:r>
-        <w:rPr>
-          <w:rFonts w:ascii="TH Sarabun New" w:hAnsi="TH Sarabun New" w:cs="TH Sarabun New"/>
-          <w:color w:val="000000"/>
-          <w:sz w:val="28"/>
-        </w:rPr>
         <w:t>_line</w:t>
       </w:r>
-      <w:proofErr w:type="spellEnd"/>
       <w:r>
         <w:rPr>
           <w:rFonts w:ascii="TH Sarabun New" w:hAnsi="TH Sarabun New" w:cs="TH Sarabun New"/>
@@ -1305,7 +1078,7 @@
     <w:p>
       <w:pPr>
         <w:rPr>
-          <w:rFonts w:ascii="TH Sarabun New" w:hAnsi="TH Sarabun New" w:cs="TH Sarabun New" w:hint="cs"/>
+          <w:rFonts w:ascii="TH Sarabun New" w:hAnsi="TH Sarabun New" w:cs="TH Sarabun New"/>
           <w:sz w:val="28"/>
           <w:szCs w:val="28"/>
           <w:cs/>
@@ -1527,25 +1300,7 @@
           <w:sz w:val="28"/>
           <w:szCs w:val="28"/>
         </w:rPr>
-        <w:t>{{</w:t>
-      </w:r>
-      <w:proofErr w:type="spellStart"/>
-      <w:r>
-        <w:rPr>
-          <w:rFonts w:ascii="TH Sarabun New" w:hAnsi="TH Sarabun New" w:cs="TH Sarabun New"/>
-          <w:sz w:val="28"/>
-          <w:szCs w:val="28"/>
-        </w:rPr>
-        <w:t>kku_report_year</w:t>
-      </w:r>
-      <w:proofErr w:type="spellEnd"/>
-      <w:r>
-        <w:rPr>
-          <w:rFonts w:ascii="TH Sarabun New" w:hAnsi="TH Sarabun New" w:cs="TH Sarabun New"/>
-          <w:sz w:val="28"/>
-          <w:szCs w:val="28"/>
-        </w:rPr>
-        <w:t xml:space="preserve">}} </w:t>
+        <w:t xml:space="preserve">{{kku_report_year}} </w:t>
       </w:r>
       <w:r>
         <w:rPr>
@@ -1711,25 +1466,7 @@
           <w:sz w:val="28"/>
           <w:szCs w:val="28"/>
         </w:rPr>
-        <w:t>{{</w:t>
-      </w:r>
-      <w:proofErr w:type="spellStart"/>
-      <w:r>
-        <w:rPr>
-          <w:rFonts w:ascii="TH Sarabun New" w:hAnsi="TH Sarabun New" w:cs="TH Sarabun New"/>
-          <w:sz w:val="28"/>
-          <w:szCs w:val="28"/>
-        </w:rPr>
-        <w:t>applicant_name</w:t>
-      </w:r>
-      <w:proofErr w:type="spellEnd"/>
-      <w:r>
-        <w:rPr>
-          <w:rFonts w:ascii="TH Sarabun New" w:hAnsi="TH Sarabun New" w:cs="TH Sarabun New"/>
-          <w:sz w:val="28"/>
-          <w:szCs w:val="28"/>
-        </w:rPr>
-        <w:t>}}</w:t>
+        <w:t>{{applicant_name}}</w:t>
       </w:r>
       <w:r>
         <w:rPr>
@@ -1738,359 +1475,6 @@
           <w:szCs w:val="28"/>
         </w:rPr>
         <w:t>)</w:t>
-      </w:r>
-    </w:p>
-    <w:p>
-      <w:pPr>
-        <w:tabs>
-          <w:tab w:val="center" w:pos="5670"/>
-        </w:tabs>
-        <w:jc w:val="thaiDistribute"/>
-        <w:rPr>
-          <w:rFonts w:ascii="TH Sarabun New" w:hAnsi="TH Sarabun New" w:cs="TH Sarabun New"/>
-          <w:sz w:val="28"/>
-          <w:szCs w:val="28"/>
-        </w:rPr>
-      </w:pPr>
-    </w:p>
-    <w:p>
-      <w:pPr>
-        <w:ind w:right="-226"/>
-        <w:jc w:val="thaiDistribute"/>
-        <w:rPr>
-          <w:rFonts w:ascii="TH Sarabun New" w:hAnsi="TH Sarabun New" w:cs="TH Sarabun New"/>
-          <w:b/>
-          <w:bCs/>
-          <w:sz w:val="28"/>
-          <w:szCs w:val="28"/>
-        </w:rPr>
-      </w:pPr>
-      <w:r>
-        <w:rPr>
-          <w:rFonts w:ascii="TH Sarabun New" w:hAnsi="TH Sarabun New" w:cs="TH Sarabun New"/>
-          <w:b/>
-          <w:bCs/>
-          <w:sz w:val="28"/>
-          <w:szCs w:val="28"/>
-          <w:cs/>
-        </w:rPr>
-        <w:t>คำ</w:t>
-      </w:r>
-      <w:r>
-        <w:rPr>
-          <w:rFonts w:ascii="TH Sarabun New" w:hAnsi="TH Sarabun New" w:cs="TH Sarabun New" w:hint="cs"/>
-          <w:b/>
-          <w:bCs/>
-          <w:sz w:val="28"/>
-          <w:szCs w:val="28"/>
-          <w:cs/>
-        </w:rPr>
-        <w:t>เห็น</w:t>
-      </w:r>
-      <w:r>
-        <w:rPr>
-          <w:rFonts w:ascii="TH Sarabun New" w:hAnsi="TH Sarabun New" w:cs="TH Sarabun New"/>
-          <w:b/>
-          <w:bCs/>
-          <w:sz w:val="28"/>
-          <w:szCs w:val="28"/>
-          <w:cs/>
-        </w:rPr>
-        <w:t>ของหัวหน้าสาขา</w:t>
-      </w:r>
-      <w:r>
-        <w:rPr>
-          <w:rFonts w:ascii="TH Sarabun New" w:hAnsi="TH Sarabun New" w:cs="TH Sarabun New"/>
-          <w:b/>
-          <w:bCs/>
-          <w:sz w:val="28"/>
-          <w:szCs w:val="28"/>
-          <w:cs/>
-        </w:rPr>
-        <w:t xml:space="preserve">วิชา </w:t>
-      </w:r>
-    </w:p>
-    <w:p>
-      <w:pPr>
-        <w:ind w:right="-5"/>
-        <w:rPr>
-          <w:rFonts w:ascii="TH Sarabun New" w:hAnsi="TH Sarabun New" w:cs="TH Sarabun New"/>
-          <w:sz w:val="28"/>
-          <w:szCs w:val="28"/>
-        </w:rPr>
-      </w:pPr>
-      <w:r>
-        <w:rPr>
-          <w:rFonts w:ascii="TH Sarabun New" w:hAnsi="TH Sarabun New" w:cs="TH Sarabun New"/>
-          <w:sz w:val="28"/>
-          <w:szCs w:val="28"/>
-        </w:rPr>
-        <w:t>{{</w:t>
-      </w:r>
-      <w:proofErr w:type="spellStart"/>
-      <w:r>
-        <w:rPr>
-          <w:rFonts w:ascii="TH Sarabun New" w:hAnsi="TH Sarabun New" w:cs="TH Sarabun New"/>
-          <w:sz w:val="28"/>
-          <w:szCs w:val="28"/>
-        </w:rPr>
-        <w:t>head_comment</w:t>
-      </w:r>
-      <w:proofErr w:type="spellEnd"/>
-      <w:r>
-        <w:rPr>
-          <w:rFonts w:ascii="TH Sarabun New" w:hAnsi="TH Sarabun New" w:cs="TH Sarabun New"/>
-          <w:sz w:val="28"/>
-          <w:szCs w:val="28"/>
-        </w:rPr>
-        <w:t>}}</w:t>
-      </w:r>
-    </w:p>
-    <w:p>
-      <w:pPr>
-        <w:ind w:right="-5"/>
-        <w:rPr>
-          <w:rFonts w:ascii="TH Sarabun New" w:hAnsi="TH Sarabun New" w:cs="TH Sarabun New" w:hint="cs"/>
-          <w:sz w:val="28"/>
-          <w:szCs w:val="28"/>
-          <w:cs/>
-        </w:rPr>
-      </w:pPr>
-    </w:p>
-    <w:p>
-      <w:pPr>
-        <w:ind w:left="3261" w:firstLine="720"/>
-        <w:jc w:val="thaiDistribute"/>
-        <w:rPr>
-          <w:rFonts w:ascii="TH Sarabun New" w:hAnsi="TH Sarabun New" w:cs="TH Sarabun New"/>
-          <w:sz w:val="28"/>
-          <w:szCs w:val="28"/>
-        </w:rPr>
-      </w:pPr>
-    </w:p>
-    <w:p>
-      <w:pPr>
-        <w:tabs>
-          <w:tab w:val="center" w:pos="5670"/>
-        </w:tabs>
-        <w:jc w:val="thaiDistribute"/>
-        <w:rPr>
-          <w:rFonts w:ascii="TH Sarabun New" w:hAnsi="TH Sarabun New" w:cs="TH Sarabun New"/>
-          <w:sz w:val="28"/>
-          <w:szCs w:val="28"/>
-        </w:rPr>
-      </w:pPr>
-      <w:r>
-        <w:rPr>
-          <w:rFonts w:ascii="TH Sarabun New" w:hAnsi="TH Sarabun New" w:cs="TH Sarabun New"/>
-          <w:sz w:val="28"/>
-          <w:szCs w:val="28"/>
-          <w:cs/>
-        </w:rPr>
-        <w:tab/>
-      </w:r>
-      <w:r>
-        <w:rPr>
-          <w:rFonts w:ascii="TH Sarabun New" w:hAnsi="TH Sarabun New" w:cs="TH Sarabun New"/>
-          <w:sz w:val="28"/>
-          <w:szCs w:val="28"/>
-        </w:rPr>
-        <w:t>(</w:t>
-      </w:r>
-      <w:r>
-        <w:rPr>
-          <w:rFonts w:ascii="TH Sarabun New" w:hAnsi="TH Sarabun New" w:cs="TH Sarabun New"/>
-          <w:sz w:val="28"/>
-          <w:szCs w:val="28"/>
-          <w:cs/>
-        </w:rPr>
-        <w:t>ลงชื่อ</w:t>
-      </w:r>
-      <w:r>
-        <w:rPr>
-          <w:rFonts w:ascii="TH Sarabun New" w:hAnsi="TH Sarabun New" w:cs="TH Sarabun New"/>
-          <w:sz w:val="28"/>
-          <w:szCs w:val="28"/>
-        </w:rPr>
-        <w:t xml:space="preserve">) </w:t>
-      </w:r>
-      <w:r>
-        <w:rPr>
-          <w:rFonts w:ascii="TH Sarabun New" w:hAnsi="TH Sarabun New" w:cs="TH Sarabun New"/>
-          <w:sz w:val="28"/>
-          <w:szCs w:val="28"/>
-        </w:rPr>
-        <w:t>{{</w:t>
-      </w:r>
-      <w:proofErr w:type="spellStart"/>
-      <w:r>
-        <w:rPr>
-          <w:rFonts w:ascii="TH Sarabun New" w:hAnsi="TH Sarabun New" w:cs="TH Sarabun New"/>
-          <w:sz w:val="28"/>
-          <w:szCs w:val="28"/>
-        </w:rPr>
-        <w:t>head_signature</w:t>
-      </w:r>
-      <w:proofErr w:type="spellEnd"/>
-      <w:r>
-        <w:rPr>
-          <w:rFonts w:ascii="TH Sarabun New" w:hAnsi="TH Sarabun New" w:cs="TH Sarabun New"/>
-          <w:sz w:val="28"/>
-          <w:szCs w:val="28"/>
-        </w:rPr>
-        <w:t>}}</w:t>
-      </w:r>
-    </w:p>
-    <w:p>
-      <w:pPr>
-        <w:tabs>
-          <w:tab w:val="center" w:pos="5670"/>
-        </w:tabs>
-        <w:jc w:val="thaiDistribute"/>
-        <w:rPr>
-          <w:rFonts w:ascii="TH Sarabun New" w:hAnsi="TH Sarabun New" w:cs="TH Sarabun New"/>
-          <w:sz w:val="28"/>
-          <w:szCs w:val="28"/>
-        </w:rPr>
-      </w:pPr>
-      <w:r>
-        <w:rPr>
-          <w:rFonts w:ascii="TH Sarabun New" w:hAnsi="TH Sarabun New" w:cs="TH Sarabun New"/>
-          <w:sz w:val="28"/>
-          <w:szCs w:val="28"/>
-          <w:cs/>
-        </w:rPr>
-        <w:tab/>
-      </w:r>
-      <w:r>
-        <w:rPr>
-          <w:rFonts w:ascii="TH Sarabun New" w:hAnsi="TH Sarabun New" w:cs="TH Sarabun New"/>
-          <w:sz w:val="28"/>
-          <w:szCs w:val="28"/>
-        </w:rPr>
-        <w:t>(</w:t>
-      </w:r>
-      <w:r>
-        <w:rPr>
-          <w:rFonts w:ascii="TH Sarabun New" w:hAnsi="TH Sarabun New" w:cs="TH Sarabun New"/>
-          <w:sz w:val="28"/>
-          <w:szCs w:val="28"/>
-        </w:rPr>
-        <w:t>{{</w:t>
-      </w:r>
-      <w:proofErr w:type="spellStart"/>
-      <w:r>
-        <w:rPr>
-          <w:rFonts w:ascii="TH Sarabun New" w:hAnsi="TH Sarabun New" w:cs="TH Sarabun New"/>
-          <w:sz w:val="28"/>
-          <w:szCs w:val="28"/>
-        </w:rPr>
-        <w:t>head_name</w:t>
-      </w:r>
-      <w:proofErr w:type="spellEnd"/>
-      <w:r>
-        <w:rPr>
-          <w:rFonts w:ascii="TH Sarabun New" w:hAnsi="TH Sarabun New" w:cs="TH Sarabun New"/>
-          <w:sz w:val="28"/>
-          <w:szCs w:val="28"/>
-        </w:rPr>
-        <w:t>}}</w:t>
-      </w:r>
-      <w:r>
-        <w:rPr>
-          <w:rFonts w:ascii="TH Sarabun New" w:hAnsi="TH Sarabun New" w:cs="TH Sarabun New"/>
-          <w:sz w:val="28"/>
-          <w:szCs w:val="28"/>
-        </w:rPr>
-        <w:t>)</w:t>
-      </w:r>
-    </w:p>
-    <w:p>
-      <w:pPr>
-        <w:tabs>
-          <w:tab w:val="center" w:pos="5670"/>
-        </w:tabs>
-        <w:jc w:val="thaiDistribute"/>
-        <w:rPr>
-          <w:rFonts w:ascii="TH Sarabun New" w:hAnsi="TH Sarabun New" w:cs="TH Sarabun New"/>
-          <w:sz w:val="28"/>
-          <w:szCs w:val="28"/>
-        </w:rPr>
-      </w:pPr>
-      <w:r>
-        <w:rPr>
-          <w:rFonts w:ascii="TH Sarabun New" w:hAnsi="TH Sarabun New" w:cs="TH Sarabun New"/>
-          <w:sz w:val="28"/>
-          <w:szCs w:val="28"/>
-          <w:cs/>
-        </w:rPr>
-        <w:tab/>
-      </w:r>
-      <w:r>
-        <w:rPr>
-          <w:rFonts w:ascii="TH Sarabun New" w:hAnsi="TH Sarabun New" w:cs="TH Sarabun New"/>
-          <w:sz w:val="28"/>
-          <w:szCs w:val="28"/>
-          <w:cs/>
-        </w:rPr>
-        <w:t xml:space="preserve">ตำแหน่ง </w:t>
-      </w:r>
-      <w:r>
-        <w:rPr>
-          <w:rFonts w:ascii="TH Sarabun New" w:hAnsi="TH Sarabun New" w:cs="TH Sarabun New" w:hint="cs"/>
-          <w:sz w:val="28"/>
-          <w:szCs w:val="28"/>
-          <w:cs/>
-        </w:rPr>
-        <w:t>หัวหน้าสาขาวิชาวิทยาการคอมพิวเตอร์</w:t>
-      </w:r>
-    </w:p>
-    <w:p>
-      <w:pPr>
-        <w:tabs>
-          <w:tab w:val="center" w:pos="5670"/>
-        </w:tabs>
-        <w:jc w:val="thaiDistribute"/>
-        <w:rPr>
-          <w:rFonts w:ascii="TH Sarabun New" w:hAnsi="TH Sarabun New" w:cs="TH Sarabun New"/>
-          <w:sz w:val="28"/>
-          <w:szCs w:val="28"/>
-        </w:rPr>
-      </w:pPr>
-      <w:r>
-        <w:rPr>
-          <w:rFonts w:ascii="TH Sarabun New" w:hAnsi="TH Sarabun New" w:cs="TH Sarabun New"/>
-          <w:sz w:val="28"/>
-          <w:szCs w:val="28"/>
-          <w:cs/>
-        </w:rPr>
-        <w:tab/>
-      </w:r>
-      <w:r>
-        <w:rPr>
-          <w:rFonts w:ascii="TH Sarabun New" w:hAnsi="TH Sarabun New" w:cs="TH Sarabun New"/>
-          <w:sz w:val="28"/>
-          <w:szCs w:val="28"/>
-        </w:rPr>
-        <w:t>{{</w:t>
-      </w:r>
-      <w:proofErr w:type="spellStart"/>
-      <w:r>
-        <w:rPr>
-          <w:rFonts w:ascii="TH Sarabun New" w:hAnsi="TH Sarabun New" w:cs="TH Sarabun New"/>
-          <w:sz w:val="28"/>
-          <w:szCs w:val="28"/>
-        </w:rPr>
-        <w:t>head_approved_date</w:t>
-      </w:r>
-      <w:proofErr w:type="spellEnd"/>
-      <w:r>
-        <w:rPr>
-          <w:rFonts w:ascii="TH Sarabun New" w:hAnsi="TH Sarabun New" w:cs="TH Sarabun New"/>
-          <w:sz w:val="28"/>
-          <w:szCs w:val="28"/>
-        </w:rPr>
-        <w:t>}}</w:t>
       </w:r>
     </w:p>
     <w:sectPr>
@@ -2294,19 +1678,8 @@
         <w:szCs w:val="28"/>
         <w:cs/>
       </w:rPr>
-      <w:t xml:space="preserve"> </w:t>
+      <w:t xml:space="preserve"> กท</w:t>
     </w:r>
-    <w:proofErr w:type="spellStart"/>
-    <w:r>
-      <w:rPr>
-        <w:rFonts w:ascii="Angsana New" w:hAnsi="Angsana New"/>
-        <w:sz w:val="28"/>
-        <w:szCs w:val="28"/>
-        <w:cs/>
-      </w:rPr>
-      <w:t>กท</w:t>
-    </w:r>
-    <w:proofErr w:type="spellEnd"/>
     <w:r>
       <w:rPr>
         <w:rFonts w:ascii="Angsana New" w:hAnsi="Angsana New" w:hint="cs"/>

</xml_diff>